<commit_message>
Finished first complete update to 4.0
</commit_message>
<xml_diff>
--- a/Documentation/Official Documentation/User's manual for IBOS MusicXmlReader version 4.0.0.0.docx
+++ b/Documentation/Official Documentation/User's manual for IBOS MusicXmlReader version 4.0.0.0.docx
@@ -11803,8 +11803,16 @@
         <w:rPr>
           <w:rFonts w:cs="Verdana" w:ascii="Verdana" w:hAnsi="Verdana"/>
         </w:rPr>
-        <w:t>Files” → “Print Music Braille file on embosser”</w:t>
-      </w:r>
+        <w:t xml:space="preserve">Files” → </w:t>
+      </w:r>
+      <w:bookmarkStart w:id="20" w:name="__DdeLink__3456_3482840894"/>
+      <w:r>
+        <w:rPr>
+          <w:rFonts w:cs="Verdana" w:ascii="Verdana" w:hAnsi="Verdana"/>
+        </w:rPr>
+        <w:t>“Print Music Braille file on embosser”</w:t>
+      </w:r>
+      <w:bookmarkEnd w:id="20"/>
     </w:p>
     <w:p>
       <w:pPr>
@@ -11850,24 +11858,33 @@
     <w:p>
       <w:pPr>
         <w:pStyle w:val="Normal"/>
+        <w:rPr/>
+      </w:pPr>
+      <w:r>
+        <w:rPr>
+          <w:rFonts w:cs="Verdana" w:ascii="Verdana" w:hAnsi="Verdana"/>
+        </w:rPr>
+        <w:t xml:space="preserve">The user can select the path and name of the Braille Music file generated through use of a standard Windows Forms “Save as” </w:t>
+      </w:r>
+      <w:r>
+        <w:rPr>
+          <w:rFonts w:cs="Verdana" w:ascii="Verdana" w:hAnsi="Verdana"/>
+        </w:rPr>
+        <w:t>dialogue.</w:t>
+      </w:r>
+    </w:p>
+    <w:p>
+      <w:pPr>
+        <w:pStyle w:val="Normal"/>
         <w:rPr>
           <w:rFonts w:ascii="Verdana" w:hAnsi="Verdana" w:cs="Verdana"/>
         </w:rPr>
       </w:pPr>
       <w:r>
-        <w:rPr/>
-      </w:r>
-    </w:p>
-    <w:p>
-      <w:pPr>
-        <w:pStyle w:val="Normal"/>
-        <w:rPr/>
-      </w:pPr>
-      <w:r>
-        <w:rPr>
-          <w:rFonts w:cs="Verdana" w:ascii="Verdana" w:hAnsi="Verdana"/>
-        </w:rPr>
-        <w:t>If IBOS MusicXmlReader is used with English as system language “ASCII” is selected as standard.</w:t>
+        <w:rPr>
+          <w:rFonts w:cs="Verdana" w:ascii="Verdana" w:hAnsi="Verdana"/>
+        </w:rPr>
+        <w:t>As default the Braille Music file will be saved alongside with the MusicXml file, but it will often be convenient to save the file directly on a USB memory stick which can be moved to an notetaker or be used by a program capable of printing a Braille Music file on a Braille embosser.</w:t>
       </w:r>
     </w:p>
     <w:p>
@@ -11881,7 +11898,573 @@
         <w:rPr>
           <w:rFonts w:cs="Verdana" w:ascii="Verdana" w:hAnsi="Verdana"/>
         </w:rPr>
-        <w:t>Furthermore the user may choose between 2 standard formattings:</w:t>
+      </w:r>
+    </w:p>
+    <w:p>
+      <w:pPr>
+        <w:pStyle w:val="Normal"/>
+        <w:rPr>
+          <w:rFonts w:ascii="Verdana" w:hAnsi="Verdana" w:cs="Verdana"/>
+        </w:rPr>
+      </w:pPr>
+      <w:r>
+        <w:rPr>
+          <w:rFonts w:cs="Verdana" w:ascii="Verdana" w:hAnsi="Verdana"/>
+        </w:rPr>
+      </w:r>
+      <w:r>
+        <w:br w:type="page"/>
+      </w:r>
+    </w:p>
+    <w:p>
+      <w:pPr>
+        <w:pStyle w:val="Overskrift2"/>
+        <w:rPr/>
+      </w:pPr>
+      <w:r>
+        <w:rPr/>
+        <w:t>Printing Braille Music files on an embosser</w:t>
+      </w:r>
+    </w:p>
+    <w:p>
+      <w:pPr>
+        <w:pStyle w:val="Normal"/>
+        <w:rPr/>
+      </w:pPr>
+      <w:r>
+        <w:rPr/>
+      </w:r>
+    </w:p>
+    <w:p>
+      <w:pPr>
+        <w:pStyle w:val="Normal"/>
+        <w:rPr/>
+      </w:pPr>
+      <w:r>
+        <w:rPr/>
+        <w:t xml:space="preserve">This is done from “Files” → </w:t>
+      </w:r>
+      <w:r>
+        <w:rPr>
+          <w:rFonts w:cs="Verdana" w:ascii="Verdana" w:hAnsi="Verdana"/>
+        </w:rPr>
+        <w:t>“Print Music Braille file on embosser” which again contains 2 subitems:</w:t>
+      </w:r>
+    </w:p>
+    <w:tbl>
+      <w:tblPr>
+        <w:tblW w:w="9026" w:type="dxa"/>
+        <w:jc w:val="left"/>
+        <w:tblInd w:w="0" w:type="dxa"/>
+        <w:tblCellMar>
+          <w:top w:w="55" w:type="dxa"/>
+          <w:left w:w="55" w:type="dxa"/>
+          <w:bottom w:w="55" w:type="dxa"/>
+          <w:right w:w="55" w:type="dxa"/>
+        </w:tblCellMar>
+      </w:tblPr>
+      <w:tblGrid>
+        <w:gridCol w:w="1755"/>
+        <w:gridCol w:w="7271"/>
+      </w:tblGrid>
+      <w:tr>
+        <w:trPr/>
+        <w:tc>
+          <w:tcPr>
+            <w:tcW w:w="1755" w:type="dxa"/>
+            <w:tcBorders>
+              <w:top w:val="single" w:sz="4" w:space="0" w:color="000000"/>
+              <w:left w:val="single" w:sz="4" w:space="0" w:color="000000"/>
+              <w:bottom w:val="single" w:sz="4" w:space="0" w:color="000000"/>
+            </w:tcBorders>
+            <w:shd w:fill="auto" w:val="clear"/>
+          </w:tcPr>
+          <w:p>
+            <w:pPr>
+              <w:pStyle w:val="Tabelindhold"/>
+              <w:jc w:val="left"/>
+              <w:rPr>
+                <w:rFonts w:ascii="Liberation Serif" w:hAnsi="Liberation Serif"/>
+                <w:b w:val="false"/>
+                <w:b w:val="false"/>
+                <w:bCs w:val="false"/>
+                <w:i w:val="false"/>
+                <w:i w:val="false"/>
+                <w:iCs w:val="false"/>
+                <w:strike w:val="false"/>
+                <w:dstrike w:val="false"/>
+                <w:outline w:val="false"/>
+                <w:shadow w:val="false"/>
+                <w:color w:val="000000"/>
+                <w:sz w:val="24"/>
+                <w:szCs w:val="24"/>
+                <w:u w:val="none"/>
+              </w:rPr>
+            </w:pPr>
+            <w:r>
+              <w:rPr>
+                <w:rFonts w:ascii="Liberation Serif" w:hAnsi="Liberation Serif"/>
+                <w:b w:val="false"/>
+                <w:bCs w:val="false"/>
+                <w:i w:val="false"/>
+                <w:iCs w:val="false"/>
+                <w:strike w:val="false"/>
+                <w:dstrike w:val="false"/>
+                <w:outline w:val="false"/>
+                <w:shadow w:val="false"/>
+                <w:color w:val="000000"/>
+                <w:sz w:val="24"/>
+                <w:szCs w:val="24"/>
+                <w:u w:val="none"/>
+              </w:rPr>
+              <w:t>Via Windows print-dialog</w:t>
+            </w:r>
+            <w:r>
+              <w:rPr>
+                <w:rFonts w:ascii="Liberation Serif" w:hAnsi="Liberation Serif"/>
+                <w:b w:val="false"/>
+                <w:bCs w:val="false"/>
+                <w:i w:val="false"/>
+                <w:iCs w:val="false"/>
+                <w:strike w:val="false"/>
+                <w:dstrike w:val="false"/>
+                <w:outline w:val="false"/>
+                <w:shadow w:val="false"/>
+                <w:color w:val="000000"/>
+                <w:sz w:val="24"/>
+                <w:szCs w:val="24"/>
+                <w:u w:val="none"/>
+              </w:rPr>
+              <w:t>ue</w:t>
+            </w:r>
+          </w:p>
+        </w:tc>
+        <w:tc>
+          <w:tcPr>
+            <w:tcW w:w="7271" w:type="dxa"/>
+            <w:tcBorders>
+              <w:top w:val="single" w:sz="4" w:space="0" w:color="000000"/>
+              <w:left w:val="single" w:sz="4" w:space="0" w:color="000000"/>
+              <w:bottom w:val="single" w:sz="4" w:space="0" w:color="000000"/>
+              <w:right w:val="single" w:sz="4" w:space="0" w:color="000000"/>
+            </w:tcBorders>
+            <w:shd w:fill="auto" w:val="clear"/>
+          </w:tcPr>
+          <w:p>
+            <w:pPr>
+              <w:pStyle w:val="Tabelindhold"/>
+              <w:jc w:val="left"/>
+              <w:rPr>
+                <w:rFonts w:ascii="Liberation Serif" w:hAnsi="Liberation Serif"/>
+                <w:b w:val="false"/>
+                <w:b w:val="false"/>
+                <w:bCs w:val="false"/>
+                <w:i w:val="false"/>
+                <w:i w:val="false"/>
+                <w:iCs w:val="false"/>
+                <w:strike w:val="false"/>
+                <w:dstrike w:val="false"/>
+                <w:outline w:val="false"/>
+                <w:shadow w:val="false"/>
+                <w:color w:val="000000"/>
+                <w:sz w:val="24"/>
+                <w:szCs w:val="24"/>
+                <w:u w:val="none"/>
+              </w:rPr>
+            </w:pPr>
+            <w:r>
+              <w:rPr>
+                <w:rFonts w:ascii="Liberation Serif" w:hAnsi="Liberation Serif"/>
+                <w:b w:val="false"/>
+                <w:bCs w:val="false"/>
+                <w:i w:val="false"/>
+                <w:iCs w:val="false"/>
+                <w:strike w:val="false"/>
+                <w:dstrike w:val="false"/>
+                <w:outline w:val="false"/>
+                <w:shadow w:val="false"/>
+                <w:color w:val="000000"/>
+                <w:sz w:val="24"/>
+                <w:szCs w:val="24"/>
+                <w:u w:val="none"/>
+              </w:rPr>
+              <w:t>Here the user first selects which of the newly generated Braille Music files to emboss, using a standard Windows “Open-dialogue”.</w:t>
+            </w:r>
+          </w:p>
+          <w:p>
+            <w:pPr>
+              <w:pStyle w:val="Tabelindhold"/>
+              <w:jc w:val="left"/>
+              <w:rPr>
+                <w:rFonts w:ascii="Liberation Serif" w:hAnsi="Liberation Serif"/>
+                <w:b w:val="false"/>
+                <w:b w:val="false"/>
+                <w:bCs w:val="false"/>
+                <w:i w:val="false"/>
+                <w:i w:val="false"/>
+                <w:iCs w:val="false"/>
+                <w:strike w:val="false"/>
+                <w:dstrike w:val="false"/>
+                <w:outline w:val="false"/>
+                <w:shadow w:val="false"/>
+                <w:color w:val="000000"/>
+                <w:sz w:val="24"/>
+                <w:szCs w:val="24"/>
+                <w:u w:val="none"/>
+              </w:rPr>
+            </w:pPr>
+            <w:r>
+              <w:rPr>
+                <w:rFonts w:ascii="Liberation Serif" w:hAnsi="Liberation Serif"/>
+                <w:b w:val="false"/>
+                <w:bCs w:val="false"/>
+                <w:i w:val="false"/>
+                <w:iCs w:val="false"/>
+                <w:strike w:val="false"/>
+                <w:dstrike w:val="false"/>
+                <w:outline w:val="false"/>
+                <w:shadow w:val="false"/>
+                <w:color w:val="000000"/>
+                <w:sz w:val="24"/>
+                <w:szCs w:val="24"/>
+                <w:u w:val="none"/>
+              </w:rPr>
+              <w:t>The an embosser is selected via a standard Windows Print-dialogue.</w:t>
+            </w:r>
+          </w:p>
+          <w:p>
+            <w:pPr>
+              <w:pStyle w:val="Tabelindhold"/>
+              <w:jc w:val="left"/>
+              <w:rPr>
+                <w:rFonts w:ascii="Liberation Serif" w:hAnsi="Liberation Serif"/>
+                <w:b w:val="false"/>
+                <w:b w:val="false"/>
+                <w:bCs w:val="false"/>
+                <w:i w:val="false"/>
+                <w:i w:val="false"/>
+                <w:iCs w:val="false"/>
+                <w:strike w:val="false"/>
+                <w:dstrike w:val="false"/>
+                <w:outline w:val="false"/>
+                <w:shadow w:val="false"/>
+                <w:color w:val="000000"/>
+                <w:sz w:val="24"/>
+                <w:szCs w:val="24"/>
+                <w:u w:val="none"/>
+              </w:rPr>
+            </w:pPr>
+            <w:r>
+              <w:rPr>
+                <w:rFonts w:ascii="Liberation Serif" w:hAnsi="Liberation Serif"/>
+                <w:b w:val="false"/>
+                <w:bCs w:val="false"/>
+                <w:i w:val="false"/>
+                <w:iCs w:val="false"/>
+                <w:strike w:val="false"/>
+                <w:dstrike w:val="false"/>
+                <w:outline w:val="false"/>
+                <w:shadow w:val="false"/>
+                <w:color w:val="000000"/>
+                <w:sz w:val="24"/>
+                <w:szCs w:val="24"/>
+                <w:u w:val="none"/>
+              </w:rPr>
+              <w:t>This is by far the most user friendly mechanism, but it can only be used if the embosser is registered by Windows as a standard Windows printer.</w:t>
+            </w:r>
+          </w:p>
+        </w:tc>
+      </w:tr>
+      <w:tr>
+        <w:trPr/>
+        <w:tc>
+          <w:tcPr>
+            <w:tcW w:w="1755" w:type="dxa"/>
+            <w:tcBorders>
+              <w:left w:val="single" w:sz="4" w:space="0" w:color="000000"/>
+              <w:bottom w:val="single" w:sz="4" w:space="0" w:color="000000"/>
+            </w:tcBorders>
+            <w:shd w:fill="auto" w:val="clear"/>
+          </w:tcPr>
+          <w:p>
+            <w:pPr>
+              <w:pStyle w:val="Tabelindhold"/>
+              <w:jc w:val="left"/>
+              <w:rPr>
+                <w:rFonts w:ascii="Liberation Serif" w:hAnsi="Liberation Serif"/>
+                <w:b w:val="false"/>
+                <w:b w:val="false"/>
+                <w:bCs w:val="false"/>
+                <w:i w:val="false"/>
+                <w:i w:val="false"/>
+                <w:iCs w:val="false"/>
+                <w:strike w:val="false"/>
+                <w:dstrike w:val="false"/>
+                <w:outline w:val="false"/>
+                <w:shadow w:val="false"/>
+                <w:color w:val="000000"/>
+                <w:sz w:val="24"/>
+                <w:szCs w:val="24"/>
+                <w:u w:val="none"/>
+              </w:rPr>
+            </w:pPr>
+            <w:r>
+              <w:rPr>
+                <w:rFonts w:ascii="Liberation Serif" w:hAnsi="Liberation Serif"/>
+                <w:b w:val="false"/>
+                <w:bCs w:val="false"/>
+                <w:i w:val="false"/>
+                <w:iCs w:val="false"/>
+                <w:strike w:val="false"/>
+                <w:dstrike w:val="false"/>
+                <w:outline w:val="false"/>
+                <w:shadow w:val="false"/>
+                <w:color w:val="000000"/>
+                <w:sz w:val="24"/>
+                <w:szCs w:val="24"/>
+                <w:u w:val="none"/>
+              </w:rPr>
+              <w:t>Via external program</w:t>
+            </w:r>
+          </w:p>
+        </w:tc>
+        <w:tc>
+          <w:tcPr>
+            <w:tcW w:w="7271" w:type="dxa"/>
+            <w:tcBorders>
+              <w:left w:val="single" w:sz="4" w:space="0" w:color="000000"/>
+              <w:bottom w:val="single" w:sz="4" w:space="0" w:color="000000"/>
+              <w:right w:val="single" w:sz="4" w:space="0" w:color="000000"/>
+            </w:tcBorders>
+            <w:shd w:fill="auto" w:val="clear"/>
+          </w:tcPr>
+          <w:p>
+            <w:pPr>
+              <w:pStyle w:val="Tabelindhold"/>
+              <w:jc w:val="left"/>
+              <w:rPr>
+                <w:rFonts w:ascii="Liberation Serif" w:hAnsi="Liberation Serif"/>
+                <w:b w:val="false"/>
+                <w:b w:val="false"/>
+                <w:bCs w:val="false"/>
+                <w:i w:val="false"/>
+                <w:i w:val="false"/>
+                <w:iCs w:val="false"/>
+                <w:strike w:val="false"/>
+                <w:dstrike w:val="false"/>
+                <w:outline w:val="false"/>
+                <w:shadow w:val="false"/>
+                <w:color w:val="000000"/>
+                <w:sz w:val="24"/>
+                <w:szCs w:val="24"/>
+                <w:u w:val="none"/>
+              </w:rPr>
+            </w:pPr>
+            <w:r>
+              <w:rPr>
+                <w:rFonts w:ascii="Liberation Serif" w:hAnsi="Liberation Serif"/>
+                <w:b w:val="false"/>
+                <w:bCs w:val="false"/>
+                <w:i w:val="false"/>
+                <w:iCs w:val="false"/>
+                <w:strike w:val="false"/>
+                <w:dstrike w:val="false"/>
+                <w:outline w:val="false"/>
+                <w:shadow w:val="false"/>
+                <w:color w:val="000000"/>
+                <w:sz w:val="24"/>
+                <w:szCs w:val="24"/>
+                <w:u w:val="none"/>
+              </w:rPr>
+              <w:t>Here the user first starts a printer control program, delivered by the supplier of the  embosser. The user must then select the file or files to be embossed, using the mechanism supported by the printer control program.</w:t>
+            </w:r>
+          </w:p>
+          <w:p>
+            <w:pPr>
+              <w:pStyle w:val="Tabelindhold"/>
+              <w:jc w:val="left"/>
+              <w:rPr>
+                <w:rFonts w:ascii="Liberation Serif" w:hAnsi="Liberation Serif"/>
+                <w:b w:val="false"/>
+                <w:b w:val="false"/>
+                <w:bCs w:val="false"/>
+                <w:i w:val="false"/>
+                <w:i w:val="false"/>
+                <w:iCs w:val="false"/>
+                <w:strike w:val="false"/>
+                <w:dstrike w:val="false"/>
+                <w:outline w:val="false"/>
+                <w:shadow w:val="false"/>
+                <w:color w:val="000000"/>
+                <w:sz w:val="24"/>
+                <w:szCs w:val="24"/>
+                <w:u w:val="none"/>
+              </w:rPr>
+            </w:pPr>
+            <w:r>
+              <w:rPr>
+                <w:rFonts w:ascii="Liberation Serif" w:hAnsi="Liberation Serif"/>
+                <w:b w:val="false"/>
+                <w:bCs w:val="false"/>
+                <w:i w:val="false"/>
+                <w:iCs w:val="false"/>
+                <w:strike w:val="false"/>
+                <w:dstrike w:val="false"/>
+                <w:outline w:val="false"/>
+                <w:shadow w:val="false"/>
+                <w:color w:val="000000"/>
+                <w:sz w:val="24"/>
+                <w:szCs w:val="24"/>
+                <w:u w:val="none"/>
+              </w:rPr>
+              <w:t>The path to the printer control program can be set up in</w:t>
+            </w:r>
+          </w:p>
+          <w:p>
+            <w:pPr>
+              <w:pStyle w:val="Tabelindhold"/>
+              <w:jc w:val="left"/>
+              <w:rPr>
+                <w:rFonts w:ascii="Liberation Serif" w:hAnsi="Liberation Serif"/>
+                <w:b w:val="false"/>
+                <w:b w:val="false"/>
+                <w:bCs w:val="false"/>
+                <w:i w:val="false"/>
+                <w:i w:val="false"/>
+                <w:iCs w:val="false"/>
+                <w:strike w:val="false"/>
+                <w:dstrike w:val="false"/>
+                <w:outline w:val="false"/>
+                <w:shadow w:val="false"/>
+                <w:color w:val="000000"/>
+                <w:sz w:val="24"/>
+                <w:szCs w:val="24"/>
+                <w:u w:val="none"/>
+              </w:rPr>
+            </w:pPr>
+            <w:r>
+              <w:rPr>
+                <w:rFonts w:ascii="Liberation Serif" w:hAnsi="Liberation Serif"/>
+                <w:b w:val="false"/>
+                <w:bCs w:val="false"/>
+                <w:i w:val="false"/>
+                <w:iCs w:val="false"/>
+                <w:strike w:val="false"/>
+                <w:dstrike w:val="false"/>
+                <w:outline w:val="false"/>
+                <w:shadow w:val="false"/>
+                <w:color w:val="000000"/>
+                <w:sz w:val="24"/>
+                <w:szCs w:val="24"/>
+                <w:u w:val="none"/>
+              </w:rPr>
+              <w:t xml:space="preserve">Settings → </w:t>
+            </w:r>
+            <w:r>
+              <w:rPr>
+                <w:rFonts w:ascii="Liberation Serif" w:hAnsi="Liberation Serif"/>
+                <w:b w:val="false"/>
+                <w:bCs w:val="false"/>
+                <w:i w:val="false"/>
+                <w:iCs w:val="false"/>
+                <w:strike w:val="false"/>
+                <w:dstrike w:val="false"/>
+                <w:outline w:val="false"/>
+                <w:shadow w:val="false"/>
+                <w:color w:val="000000"/>
+                <w:sz w:val="24"/>
+                <w:szCs w:val="24"/>
+                <w:u w:val="none"/>
+              </w:rPr>
+              <w:t>Settings for Embosser profile → Embosser program path</w:t>
+            </w:r>
+          </w:p>
+          <w:p>
+            <w:pPr>
+              <w:pStyle w:val="Tabelindhold"/>
+              <w:jc w:val="left"/>
+              <w:rPr>
+                <w:rFonts w:ascii="Liberation Serif" w:hAnsi="Liberation Serif"/>
+                <w:b w:val="false"/>
+                <w:b w:val="false"/>
+                <w:bCs w:val="false"/>
+                <w:i w:val="false"/>
+                <w:i w:val="false"/>
+                <w:iCs w:val="false"/>
+                <w:strike w:val="false"/>
+                <w:dstrike w:val="false"/>
+                <w:outline w:val="false"/>
+                <w:shadow w:val="false"/>
+                <w:color w:val="000000"/>
+                <w:sz w:val="24"/>
+                <w:szCs w:val="24"/>
+                <w:u w:val="none"/>
+              </w:rPr>
+            </w:pPr>
+            <w:r>
+              <w:rPr>
+                <w:rFonts w:ascii="Liberation Serif" w:hAnsi="Liberation Serif"/>
+                <w:b w:val="false"/>
+                <w:bCs w:val="false"/>
+                <w:i w:val="false"/>
+                <w:iCs w:val="false"/>
+                <w:strike w:val="false"/>
+                <w:dstrike w:val="false"/>
+                <w:outline w:val="false"/>
+                <w:shadow w:val="false"/>
+                <w:color w:val="000000"/>
+                <w:sz w:val="24"/>
+                <w:szCs w:val="24"/>
+                <w:u w:val="none"/>
+              </w:rPr>
+              <w:t xml:space="preserve">This path is as default set up to the default path to the “IbPrint” printer controller program from “Index Braille” </w:t>
+            </w:r>
+          </w:p>
+        </w:tc>
+      </w:tr>
+    </w:tbl>
+    <w:p>
+      <w:pPr>
+        <w:pStyle w:val="Normal"/>
+        <w:rPr>
+          <w:rFonts w:ascii="Verdana" w:hAnsi="Verdana" w:cs="Verdana"/>
+        </w:rPr>
+      </w:pPr>
+      <w:r>
+        <w:rPr/>
+      </w:r>
+    </w:p>
+    <w:p>
+      <w:pPr>
+        <w:pStyle w:val="Overskrift2"/>
+        <w:rPr/>
+      </w:pPr>
+      <w:r>
+        <w:rPr/>
+        <w:t>Copying of Music Braille files to notetaker device</w:t>
+      </w:r>
+    </w:p>
+    <w:p>
+      <w:pPr>
+        <w:pStyle w:val="Normal"/>
+        <w:rPr>
+          <w:rFonts w:ascii="Verdana" w:hAnsi="Verdana" w:cs="Verdana"/>
+        </w:rPr>
+      </w:pPr>
+      <w:r>
+        <w:rPr/>
+      </w:r>
+    </w:p>
+    <w:p>
+      <w:pPr>
+        <w:pStyle w:val="Normal"/>
+        <w:rPr/>
+      </w:pPr>
+      <w:r>
+        <w:rPr>
+          <w:rFonts w:cs="Verdana" w:ascii="Verdana" w:hAnsi="Verdana"/>
+        </w:rPr>
+        <w:t>This is done from</w:t>
       </w:r>
     </w:p>
     <w:p>
@@ -11899,25 +12482,19 @@
         <w:rPr>
           <w:rFonts w:cs="Verdana" w:ascii="Verdana" w:hAnsi="Verdana"/>
         </w:rPr>
-        <w:t>Notetaker” Here the Braille Music is formatted as shown in the notelist.</w:t>
-      </w:r>
-    </w:p>
-    <w:p>
-      <w:pPr>
-        <w:pStyle w:val="Normal"/>
-        <w:rPr/>
-      </w:pPr>
-      <w:r>
-        <w:rPr>
-          <w:rFonts w:cs="Verdana" w:ascii="Verdana" w:hAnsi="Verdana"/>
-        </w:rPr>
-        <w:t>“</w:t>
-      </w:r>
-      <w:r>
-        <w:rPr>
-          <w:rFonts w:cs="Verdana" w:ascii="Verdana" w:hAnsi="Verdana"/>
-        </w:rPr>
-        <w:t>Embosser” Here the Braille Music is formatted with 40 characters per line to prevent excessive use of embosser paper.</w:t>
+        <w:t xml:space="preserve">Files” → “Copy Braille Music file to Braille Device using Windows Explorer” </w:t>
+      </w:r>
+    </w:p>
+    <w:p>
+      <w:pPr>
+        <w:pStyle w:val="Normal"/>
+        <w:rPr/>
+      </w:pPr>
+      <w:r>
+        <w:rPr>
+          <w:rFonts w:cs="Verdana" w:ascii="Verdana" w:hAnsi="Verdana"/>
+        </w:rPr>
+        <w:t>Windows Explorer will open in the path where the most recently generated Music Braille files were placed. The user can then specify the further actions.</w:t>
       </w:r>
     </w:p>
     <w:p>
@@ -11928,21 +12505,10 @@
         </w:rPr>
       </w:pPr>
       <w:r>
-        <w:rPr>
-          <w:rFonts w:cs="Verdana" w:ascii="Verdana" w:hAnsi="Verdana"/>
-        </w:rPr>
-      </w:r>
-    </w:p>
-    <w:p>
-      <w:pPr>
-        <w:pStyle w:val="Normal"/>
-        <w:rPr/>
-      </w:pPr>
-      <w:r>
-        <w:rPr>
-          <w:rFonts w:cs="Verdana" w:ascii="Verdana" w:hAnsi="Verdana"/>
-        </w:rPr>
-        <w:t>The user can select the path and name of the Braille Music file generated through use of a standard Windows Forms “Save as” dialog.</w:t>
+        <w:rPr/>
+      </w:r>
+      <w:r>
+        <w:br w:type="page"/>
       </w:r>
     </w:p>
     <w:p>
@@ -11956,49 +12522,6 @@
         <w:rPr>
           <w:rFonts w:cs="Verdana" w:ascii="Verdana" w:hAnsi="Verdana"/>
         </w:rPr>
-      </w:r>
-    </w:p>
-    <w:p>
-      <w:pPr>
-        <w:pStyle w:val="Normal"/>
-        <w:rPr>
-          <w:rFonts w:ascii="Verdana" w:hAnsi="Verdana" w:cs="Verdana"/>
-        </w:rPr>
-      </w:pPr>
-      <w:r>
-        <w:rPr>
-          <w:rFonts w:cs="Verdana" w:ascii="Verdana" w:hAnsi="Verdana"/>
-        </w:rPr>
-        <w:t>As default the Braille Music file will be saved alongside with the MusicXml file, but it will often be convenient to save the file directly on a USB memory stick which can be moved to an notetaker or be used by a program capable of printing a Braille Music file on a Braille embosser.</w:t>
-      </w:r>
-    </w:p>
-    <w:p>
-      <w:pPr>
-        <w:pStyle w:val="Normal"/>
-        <w:rPr>
-          <w:rFonts w:ascii="Verdana" w:hAnsi="Verdana" w:cs="Verdana"/>
-        </w:rPr>
-      </w:pPr>
-      <w:r>
-        <w:rPr>
-          <w:rFonts w:cs="Verdana" w:ascii="Verdana" w:hAnsi="Verdana"/>
-        </w:rPr>
-      </w:r>
-    </w:p>
-    <w:p>
-      <w:pPr>
-        <w:pStyle w:val="Normal"/>
-        <w:rPr>
-          <w:rFonts w:ascii="Verdana" w:hAnsi="Verdana" w:cs="Verdana"/>
-        </w:rPr>
-      </w:pPr>
-      <w:r>
-        <w:rPr>
-          <w:rFonts w:cs="Verdana" w:ascii="Verdana" w:hAnsi="Verdana"/>
-        </w:rPr>
-      </w:r>
-      <w:r>
-        <w:br w:type="page"/>
       </w:r>
     </w:p>
     <w:p>
@@ -12023,8 +12546,8 @@
         </w:numPr>
         <w:rPr/>
       </w:pPr>
-      <w:bookmarkStart w:id="20" w:name="__RefHeading___Toc531086877"/>
-      <w:bookmarkEnd w:id="20"/>
+      <w:bookmarkStart w:id="21" w:name="__RefHeading___Toc531086877"/>
+      <w:bookmarkEnd w:id="21"/>
       <w:r>
         <w:rPr/>
         <w:t>Keyboard shortcuts</w:t>
@@ -12180,6 +12703,51 @@
             <w:pPr>
               <w:pStyle w:val="Tabelindhold"/>
               <w:rPr>
+                <w:rFonts w:ascii="Verdana" w:hAnsi="Verdana"/>
+              </w:rPr>
+            </w:pPr>
+            <w:r>
+              <w:rPr>
+                <w:rFonts w:ascii="Verdana" w:hAnsi="Verdana"/>
+              </w:rPr>
+              <w:t xml:space="preserve">CONTROL + P </w:t>
+            </w:r>
+          </w:p>
+        </w:tc>
+        <w:tc>
+          <w:tcPr>
+            <w:tcW w:w="6360" w:type="dxa"/>
+            <w:tcBorders/>
+            <w:shd w:fill="auto" w:val="clear"/>
+          </w:tcPr>
+          <w:p>
+            <w:pPr>
+              <w:pStyle w:val="Tabelindhold"/>
+              <w:rPr>
+                <w:rFonts w:ascii="Verdana" w:hAnsi="Verdana"/>
+              </w:rPr>
+            </w:pPr>
+            <w:r>
+              <w:rPr>
+                <w:rFonts w:ascii="Verdana" w:hAnsi="Verdana"/>
+              </w:rPr>
+              <w:t>Print Music Braille file on embosser via Windows Print-dialog</w:t>
+            </w:r>
+          </w:p>
+        </w:tc>
+      </w:tr>
+      <w:tr>
+        <w:trPr/>
+        <w:tc>
+          <w:tcPr>
+            <w:tcW w:w="3284" w:type="dxa"/>
+            <w:tcBorders/>
+            <w:shd w:fill="auto" w:val="clear"/>
+          </w:tcPr>
+          <w:p>
+            <w:pPr>
+              <w:pStyle w:val="Tabelindhold"/>
+              <w:rPr>
                 <w:rFonts w:ascii="Verdana" w:hAnsi="Verdana" w:cs="Verdana"/>
               </w:rPr>
             </w:pPr>
@@ -14863,8 +15431,8 @@
         </w:numPr>
         <w:rPr/>
       </w:pPr>
-      <w:bookmarkStart w:id="21" w:name="__RefHeading___Toc531086878"/>
-      <w:bookmarkEnd w:id="21"/>
+      <w:bookmarkStart w:id="22" w:name="__RefHeading___Toc531086878"/>
+      <w:bookmarkEnd w:id="22"/>
       <w:r>
         <w:rPr/>
         <w:t>Localization</w:t>
@@ -14941,7 +15509,69 @@
         <w:rPr>
           <w:rFonts w:cs="Verdana" w:ascii="Verdana" w:hAnsi="Verdana"/>
         </w:rPr>
-        <w:t>However, all texts displayed in the user interface, including the program's name, are located so that they appear in Danish on a Danish PC and in English on an English PC. The localization to English is not yet thoroughly tested!</w:t>
+        <w:t xml:space="preserve">However, all texts displayed in the user interface, including the program's name, are located so that they appear in Danish </w:t>
+      </w:r>
+      <w:r>
+        <w:rPr>
+          <w:rFonts w:cs="Verdana" w:ascii="Verdana" w:hAnsi="Verdana"/>
+        </w:rPr>
+        <w:t xml:space="preserve">to a suer using Danish as default language </w:t>
+      </w:r>
+      <w:r>
+        <w:rPr>
+          <w:rFonts w:cs="Verdana" w:ascii="Verdana" w:hAnsi="Verdana"/>
+        </w:rPr>
+        <w:t xml:space="preserve">and in English </w:t>
+      </w:r>
+      <w:r>
+        <w:rPr>
+          <w:rFonts w:cs="Verdana" w:ascii="Verdana" w:hAnsi="Verdana"/>
+        </w:rPr>
+        <w:t>for a user using English as default language</w:t>
+      </w:r>
+      <w:r>
+        <w:rPr>
+          <w:rFonts w:cs="Verdana" w:ascii="Verdana" w:hAnsi="Verdana"/>
+        </w:rPr>
+        <w:t xml:space="preserve">. </w:t>
+      </w:r>
+    </w:p>
+    <w:p>
+      <w:pPr>
+        <w:pStyle w:val="Normal"/>
+        <w:rPr>
+          <w:rFonts w:ascii="Verdana" w:hAnsi="Verdana" w:cs="Verdana"/>
+        </w:rPr>
+      </w:pPr>
+      <w:r>
+        <w:rPr>
+          <w:rFonts w:cs="Verdana" w:ascii="Verdana" w:hAnsi="Verdana"/>
+        </w:rPr>
+        <w:t>Starting at version 4.0 IBOS MusicXmlReader has also been localized to Dutch!</w:t>
+      </w:r>
+    </w:p>
+    <w:p>
+      <w:pPr>
+        <w:pStyle w:val="Normal"/>
+        <w:rPr/>
+      </w:pPr>
+      <w:r>
+        <w:rPr>
+          <w:rFonts w:cs="Verdana" w:ascii="Verdana" w:hAnsi="Verdana"/>
+        </w:rPr>
+        <w:t xml:space="preserve">The localization to English </w:t>
+      </w:r>
+      <w:r>
+        <w:rPr>
+          <w:rFonts w:cs="Verdana" w:ascii="Verdana" w:hAnsi="Verdana"/>
+        </w:rPr>
+        <w:t xml:space="preserve">and Dutch </w:t>
+      </w:r>
+      <w:r>
+        <w:rPr>
+          <w:rFonts w:cs="Verdana" w:ascii="Verdana" w:hAnsi="Verdana"/>
+        </w:rPr>
+        <w:t>is not yet thoroughly tested!</w:t>
       </w:r>
     </w:p>
     <w:p>
@@ -14981,8 +15611,8 @@
         </w:numPr>
         <w:rPr/>
       </w:pPr>
-      <w:bookmarkStart w:id="22" w:name="__RefHeading___Toc531086879"/>
-      <w:bookmarkEnd w:id="22"/>
+      <w:bookmarkStart w:id="23" w:name="__RefHeading___Toc531086879"/>
+      <w:bookmarkEnd w:id="23"/>
       <w:r>
         <w:rPr/>
         <w:t>Using a Perkins keyboard</w:t>
@@ -15059,8 +15689,8 @@
         </w:numPr>
         <w:rPr/>
       </w:pPr>
-      <w:bookmarkStart w:id="23" w:name="__RefHeading___Toc531086880"/>
-      <w:bookmarkEnd w:id="23"/>
+      <w:bookmarkStart w:id="24" w:name="__RefHeading___Toc531086880"/>
+      <w:bookmarkEnd w:id="24"/>
       <w:r>
         <w:rPr/>
         <w:t>Optimizing cooperation with JAWS</w:t>
@@ -15220,7 +15850,7 @@
       <w:rPr>
         <w:rStyle w:val="Sidetal"/>
       </w:rPr>
-      <w:t>27</w:t>
+      <w:t>1</w:t>
     </w:r>
     <w:r>
       <w:rPr>
@@ -15295,7 +15925,7 @@
       <w:rPr>
         <w:rStyle w:val="Sidetal"/>
       </w:rPr>
-      <w:t>27</w:t>
+      <w:t>1</w:t>
     </w:r>
     <w:r>
       <w:rPr>

</xml_diff>

<commit_message>
Fixed typo in english Users manual
</commit_message>
<xml_diff>
--- a/Documentation/Official Documentation/User's manual for IBOS MusicXmlReader version 4.0.0.0.docx
+++ b/Documentation/Official Documentation/User's manual for IBOS MusicXmlReader version 4.0.0.0.docx
@@ -1332,14 +1332,14 @@
         </w:tblCellMar>
       </w:tblPr>
       <w:tblGrid>
-        <w:gridCol w:w="1685"/>
-        <w:gridCol w:w="7490"/>
+        <w:gridCol w:w="1684"/>
+        <w:gridCol w:w="7491"/>
       </w:tblGrid>
       <w:tr>
         <w:trPr/>
         <w:tc>
           <w:tcPr>
-            <w:tcW w:w="1685" w:type="dxa"/>
+            <w:tcW w:w="1684" w:type="dxa"/>
             <w:tcBorders>
               <w:top w:val="single" w:sz="4" w:space="0" w:color="000000"/>
               <w:left w:val="single" w:sz="4" w:space="0" w:color="000000"/>
@@ -1367,7 +1367,7 @@
         </w:tc>
         <w:tc>
           <w:tcPr>
-            <w:tcW w:w="7490" w:type="dxa"/>
+            <w:tcW w:w="7491" w:type="dxa"/>
             <w:tcBorders>
               <w:top w:val="single" w:sz="4" w:space="0" w:color="000000"/>
               <w:left w:val="single" w:sz="4" w:space="0" w:color="000000"/>
@@ -1409,7 +1409,7 @@
         <w:trPr/>
         <w:tc>
           <w:tcPr>
-            <w:tcW w:w="1685" w:type="dxa"/>
+            <w:tcW w:w="1684" w:type="dxa"/>
             <w:tcBorders>
               <w:top w:val="single" w:sz="4" w:space="0" w:color="000000"/>
               <w:left w:val="single" w:sz="4" w:space="0" w:color="000000"/>
@@ -1439,7 +1439,7 @@
         </w:tc>
         <w:tc>
           <w:tcPr>
-            <w:tcW w:w="7490" w:type="dxa"/>
+            <w:tcW w:w="7491" w:type="dxa"/>
             <w:tcBorders>
               <w:top w:val="single" w:sz="4" w:space="0" w:color="000000"/>
               <w:left w:val="single" w:sz="4" w:space="0" w:color="000000"/>
@@ -1507,7 +1507,7 @@
         <w:trPr/>
         <w:tc>
           <w:tcPr>
-            <w:tcW w:w="1685" w:type="dxa"/>
+            <w:tcW w:w="1684" w:type="dxa"/>
             <w:tcBorders>
               <w:top w:val="single" w:sz="4" w:space="0" w:color="000000"/>
               <w:left w:val="single" w:sz="4" w:space="0" w:color="000000"/>
@@ -1535,7 +1535,7 @@
         </w:tc>
         <w:tc>
           <w:tcPr>
-            <w:tcW w:w="7490" w:type="dxa"/>
+            <w:tcW w:w="7491" w:type="dxa"/>
             <w:tcBorders>
               <w:top w:val="single" w:sz="4" w:space="0" w:color="000000"/>
               <w:left w:val="single" w:sz="4" w:space="0" w:color="000000"/>
@@ -1565,7 +1565,7 @@
         <w:trPr/>
         <w:tc>
           <w:tcPr>
-            <w:tcW w:w="1685" w:type="dxa"/>
+            <w:tcW w:w="1684" w:type="dxa"/>
             <w:tcBorders>
               <w:top w:val="single" w:sz="4" w:space="0" w:color="000000"/>
               <w:left w:val="single" w:sz="4" w:space="0" w:color="000000"/>
@@ -1593,7 +1593,7 @@
         </w:tc>
         <w:tc>
           <w:tcPr>
-            <w:tcW w:w="7490" w:type="dxa"/>
+            <w:tcW w:w="7491" w:type="dxa"/>
             <w:tcBorders>
               <w:top w:val="single" w:sz="4" w:space="0" w:color="000000"/>
               <w:left w:val="single" w:sz="4" w:space="0" w:color="000000"/>
@@ -1639,7 +1639,7 @@
         <w:trPr/>
         <w:tc>
           <w:tcPr>
-            <w:tcW w:w="1685" w:type="dxa"/>
+            <w:tcW w:w="1684" w:type="dxa"/>
             <w:tcBorders>
               <w:top w:val="single" w:sz="4" w:space="0" w:color="000000"/>
               <w:left w:val="single" w:sz="4" w:space="0" w:color="000000"/>
@@ -1672,7 +1672,7 @@
         </w:tc>
         <w:tc>
           <w:tcPr>
-            <w:tcW w:w="7490" w:type="dxa"/>
+            <w:tcW w:w="7491" w:type="dxa"/>
             <w:tcBorders>
               <w:top w:val="single" w:sz="4" w:space="0" w:color="000000"/>
               <w:left w:val="single" w:sz="4" w:space="0" w:color="000000"/>
@@ -2218,9 +2218,9 @@
         </w:tblCellMar>
       </w:tblPr>
       <w:tblGrid>
-        <w:gridCol w:w="1585"/>
+        <w:gridCol w:w="1584"/>
         <w:gridCol w:w="5220"/>
-        <w:gridCol w:w="2210"/>
+        <w:gridCol w:w="2211"/>
       </w:tblGrid>
       <w:tr>
         <w:trPr>
@@ -2228,7 +2228,7 @@
         </w:trPr>
         <w:tc>
           <w:tcPr>
-            <w:tcW w:w="1585" w:type="dxa"/>
+            <w:tcW w:w="1584" w:type="dxa"/>
             <w:tcBorders>
               <w:top w:val="single" w:sz="2" w:space="0" w:color="000000"/>
               <w:left w:val="single" w:sz="2" w:space="0" w:color="000000"/>
@@ -2298,7 +2298,7 @@
         </w:tc>
         <w:tc>
           <w:tcPr>
-            <w:tcW w:w="2210" w:type="dxa"/>
+            <w:tcW w:w="2211" w:type="dxa"/>
             <w:tcBorders>
               <w:top w:val="single" w:sz="2" w:space="0" w:color="000000"/>
               <w:left w:val="single" w:sz="2" w:space="0" w:color="000000"/>
@@ -2329,7 +2329,7 @@
         <w:trPr/>
         <w:tc>
           <w:tcPr>
-            <w:tcW w:w="1585" w:type="dxa"/>
+            <w:tcW w:w="1584" w:type="dxa"/>
             <w:tcBorders>
               <w:left w:val="single" w:sz="2" w:space="0" w:color="000000"/>
               <w:bottom w:val="single" w:sz="2" w:space="0" w:color="000000"/>
@@ -2393,7 +2393,7 @@
         </w:tc>
         <w:tc>
           <w:tcPr>
-            <w:tcW w:w="2210" w:type="dxa"/>
+            <w:tcW w:w="2211" w:type="dxa"/>
             <w:tcBorders>
               <w:left w:val="single" w:sz="2" w:space="0" w:color="000000"/>
               <w:bottom w:val="single" w:sz="2" w:space="0" w:color="000000"/>
@@ -2420,7 +2420,7 @@
         <w:trPr/>
         <w:tc>
           <w:tcPr>
-            <w:tcW w:w="1585" w:type="dxa"/>
+            <w:tcW w:w="1584" w:type="dxa"/>
             <w:tcBorders>
               <w:left w:val="single" w:sz="2" w:space="0" w:color="000000"/>
               <w:bottom w:val="single" w:sz="2" w:space="0" w:color="000000"/>
@@ -2481,7 +2481,7 @@
         </w:tc>
         <w:tc>
           <w:tcPr>
-            <w:tcW w:w="2210" w:type="dxa"/>
+            <w:tcW w:w="2211" w:type="dxa"/>
             <w:tcBorders>
               <w:left w:val="single" w:sz="2" w:space="0" w:color="000000"/>
               <w:bottom w:val="single" w:sz="2" w:space="0" w:color="000000"/>
@@ -2508,7 +2508,7 @@
         <w:trPr/>
         <w:tc>
           <w:tcPr>
-            <w:tcW w:w="1585" w:type="dxa"/>
+            <w:tcW w:w="1584" w:type="dxa"/>
             <w:tcBorders>
               <w:left w:val="single" w:sz="2" w:space="0" w:color="000000"/>
               <w:bottom w:val="single" w:sz="2" w:space="0" w:color="000000"/>
@@ -2555,7 +2555,7 @@
         </w:tc>
         <w:tc>
           <w:tcPr>
-            <w:tcW w:w="2210" w:type="dxa"/>
+            <w:tcW w:w="2211" w:type="dxa"/>
             <w:tcBorders>
               <w:left w:val="single" w:sz="2" w:space="0" w:color="000000"/>
               <w:bottom w:val="single" w:sz="2" w:space="0" w:color="000000"/>
@@ -2600,7 +2600,7 @@
         <w:trPr/>
         <w:tc>
           <w:tcPr>
-            <w:tcW w:w="1585" w:type="dxa"/>
+            <w:tcW w:w="1584" w:type="dxa"/>
             <w:tcBorders>
               <w:left w:val="single" w:sz="2" w:space="0" w:color="000000"/>
               <w:bottom w:val="single" w:sz="2" w:space="0" w:color="000000"/>
@@ -2649,7 +2649,7 @@
         </w:tc>
         <w:tc>
           <w:tcPr>
-            <w:tcW w:w="2210" w:type="dxa"/>
+            <w:tcW w:w="2211" w:type="dxa"/>
             <w:tcBorders>
               <w:left w:val="single" w:sz="2" w:space="0" w:color="000000"/>
               <w:bottom w:val="single" w:sz="2" w:space="0" w:color="000000"/>
@@ -2679,7 +2679,7 @@
         <w:trPr/>
         <w:tc>
           <w:tcPr>
-            <w:tcW w:w="1585" w:type="dxa"/>
+            <w:tcW w:w="1584" w:type="dxa"/>
             <w:tcBorders>
               <w:left w:val="single" w:sz="2" w:space="0" w:color="000000"/>
               <w:bottom w:val="single" w:sz="2" w:space="0" w:color="000000"/>
@@ -2728,7 +2728,7 @@
         </w:tc>
         <w:tc>
           <w:tcPr>
-            <w:tcW w:w="2210" w:type="dxa"/>
+            <w:tcW w:w="2211" w:type="dxa"/>
             <w:tcBorders>
               <w:left w:val="single" w:sz="2" w:space="0" w:color="000000"/>
               <w:bottom w:val="single" w:sz="2" w:space="0" w:color="000000"/>
@@ -2758,7 +2758,7 @@
         <w:trPr/>
         <w:tc>
           <w:tcPr>
-            <w:tcW w:w="1585" w:type="dxa"/>
+            <w:tcW w:w="1584" w:type="dxa"/>
             <w:tcBorders>
               <w:left w:val="single" w:sz="2" w:space="0" w:color="000000"/>
               <w:bottom w:val="single" w:sz="2" w:space="0" w:color="000000"/>
@@ -2807,7 +2807,7 @@
         </w:tc>
         <w:tc>
           <w:tcPr>
-            <w:tcW w:w="2210" w:type="dxa"/>
+            <w:tcW w:w="2211" w:type="dxa"/>
             <w:tcBorders>
               <w:left w:val="single" w:sz="2" w:space="0" w:color="000000"/>
               <w:bottom w:val="single" w:sz="2" w:space="0" w:color="000000"/>
@@ -2837,7 +2837,7 @@
         <w:trPr/>
         <w:tc>
           <w:tcPr>
-            <w:tcW w:w="1585" w:type="dxa"/>
+            <w:tcW w:w="1584" w:type="dxa"/>
             <w:tcBorders>
               <w:left w:val="single" w:sz="2" w:space="0" w:color="000000"/>
               <w:bottom w:val="single" w:sz="2" w:space="0" w:color="000000"/>
@@ -2883,7 +2883,7 @@
         </w:tc>
         <w:tc>
           <w:tcPr>
-            <w:tcW w:w="2210" w:type="dxa"/>
+            <w:tcW w:w="2211" w:type="dxa"/>
             <w:tcBorders>
               <w:left w:val="single" w:sz="2" w:space="0" w:color="000000"/>
               <w:bottom w:val="single" w:sz="2" w:space="0" w:color="000000"/>
@@ -2913,7 +2913,7 @@
         <w:trPr/>
         <w:tc>
           <w:tcPr>
-            <w:tcW w:w="1585" w:type="dxa"/>
+            <w:tcW w:w="1584" w:type="dxa"/>
             <w:tcBorders>
               <w:left w:val="single" w:sz="2" w:space="0" w:color="000000"/>
               <w:bottom w:val="single" w:sz="2" w:space="0" w:color="000000"/>
@@ -2973,7 +2973,7 @@
         </w:tc>
         <w:tc>
           <w:tcPr>
-            <w:tcW w:w="2210" w:type="dxa"/>
+            <w:tcW w:w="2211" w:type="dxa"/>
             <w:tcBorders>
               <w:left w:val="single" w:sz="2" w:space="0" w:color="000000"/>
               <w:bottom w:val="single" w:sz="2" w:space="0" w:color="000000"/>
@@ -3007,7 +3007,7 @@
         <w:trPr/>
         <w:tc>
           <w:tcPr>
-            <w:tcW w:w="1585" w:type="dxa"/>
+            <w:tcW w:w="1584" w:type="dxa"/>
             <w:tcBorders>
               <w:left w:val="single" w:sz="2" w:space="0" w:color="000000"/>
               <w:bottom w:val="single" w:sz="2" w:space="0" w:color="000000"/>
@@ -3067,7 +3067,7 @@
         </w:tc>
         <w:tc>
           <w:tcPr>
-            <w:tcW w:w="2210" w:type="dxa"/>
+            <w:tcW w:w="2211" w:type="dxa"/>
             <w:tcBorders>
               <w:left w:val="single" w:sz="2" w:space="0" w:color="000000"/>
               <w:bottom w:val="single" w:sz="2" w:space="0" w:color="000000"/>
@@ -3101,7 +3101,7 @@
         <w:trPr/>
         <w:tc>
           <w:tcPr>
-            <w:tcW w:w="1585" w:type="dxa"/>
+            <w:tcW w:w="1584" w:type="dxa"/>
             <w:tcBorders>
               <w:left w:val="single" w:sz="2" w:space="0" w:color="000000"/>
               <w:bottom w:val="single" w:sz="2" w:space="0" w:color="000000"/>
@@ -3161,7 +3161,7 @@
         </w:tc>
         <w:tc>
           <w:tcPr>
-            <w:tcW w:w="2210" w:type="dxa"/>
+            <w:tcW w:w="2211" w:type="dxa"/>
             <w:tcBorders>
               <w:left w:val="single" w:sz="2" w:space="0" w:color="000000"/>
               <w:bottom w:val="single" w:sz="2" w:space="0" w:color="000000"/>
@@ -3194,7 +3194,7 @@
         <w:trPr/>
         <w:tc>
           <w:tcPr>
-            <w:tcW w:w="1585" w:type="dxa"/>
+            <w:tcW w:w="1584" w:type="dxa"/>
             <w:tcBorders>
               <w:left w:val="single" w:sz="2" w:space="0" w:color="000000"/>
               <w:bottom w:val="single" w:sz="2" w:space="0" w:color="000000"/>
@@ -3243,7 +3243,7 @@
         </w:tc>
         <w:tc>
           <w:tcPr>
-            <w:tcW w:w="2210" w:type="dxa"/>
+            <w:tcW w:w="2211" w:type="dxa"/>
             <w:tcBorders>
               <w:left w:val="single" w:sz="2" w:space="0" w:color="000000"/>
               <w:bottom w:val="single" w:sz="2" w:space="0" w:color="000000"/>
@@ -3273,7 +3273,7 @@
         <w:trPr/>
         <w:tc>
           <w:tcPr>
-            <w:tcW w:w="1585" w:type="dxa"/>
+            <w:tcW w:w="1584" w:type="dxa"/>
             <w:tcBorders>
               <w:left w:val="single" w:sz="2" w:space="0" w:color="000000"/>
               <w:bottom w:val="single" w:sz="2" w:space="0" w:color="000000"/>
@@ -3327,7 +3327,7 @@
         </w:tc>
         <w:tc>
           <w:tcPr>
-            <w:tcW w:w="2210" w:type="dxa"/>
+            <w:tcW w:w="2211" w:type="dxa"/>
             <w:tcBorders>
               <w:left w:val="single" w:sz="2" w:space="0" w:color="000000"/>
               <w:bottom w:val="single" w:sz="2" w:space="0" w:color="000000"/>
@@ -3359,7 +3359,7 @@
         <w:trPr/>
         <w:tc>
           <w:tcPr>
-            <w:tcW w:w="1585" w:type="dxa"/>
+            <w:tcW w:w="1584" w:type="dxa"/>
             <w:tcBorders>
               <w:left w:val="single" w:sz="2" w:space="0" w:color="000000"/>
               <w:bottom w:val="single" w:sz="2" w:space="0" w:color="000000"/>
@@ -3411,7 +3411,7 @@
         </w:tc>
         <w:tc>
           <w:tcPr>
-            <w:tcW w:w="2210" w:type="dxa"/>
+            <w:tcW w:w="2211" w:type="dxa"/>
             <w:tcBorders>
               <w:left w:val="single" w:sz="2" w:space="0" w:color="000000"/>
               <w:bottom w:val="single" w:sz="2" w:space="0" w:color="000000"/>
@@ -3441,7 +3441,7 @@
         <w:trPr/>
         <w:tc>
           <w:tcPr>
-            <w:tcW w:w="1585" w:type="dxa"/>
+            <w:tcW w:w="1584" w:type="dxa"/>
             <w:tcBorders>
               <w:left w:val="single" w:sz="2" w:space="0" w:color="000000"/>
               <w:bottom w:val="single" w:sz="2" w:space="0" w:color="000000"/>
@@ -3495,7 +3495,7 @@
         </w:tc>
         <w:tc>
           <w:tcPr>
-            <w:tcW w:w="2210" w:type="dxa"/>
+            <w:tcW w:w="2211" w:type="dxa"/>
             <w:tcBorders>
               <w:left w:val="single" w:sz="2" w:space="0" w:color="000000"/>
               <w:bottom w:val="single" w:sz="2" w:space="0" w:color="000000"/>
@@ -3525,7 +3525,7 @@
         <w:trPr/>
         <w:tc>
           <w:tcPr>
-            <w:tcW w:w="1585" w:type="dxa"/>
+            <w:tcW w:w="1584" w:type="dxa"/>
             <w:tcBorders>
               <w:left w:val="single" w:sz="2" w:space="0" w:color="000000"/>
               <w:bottom w:val="single" w:sz="2" w:space="0" w:color="000000"/>
@@ -3579,7 +3579,7 @@
         </w:tc>
         <w:tc>
           <w:tcPr>
-            <w:tcW w:w="2210" w:type="dxa"/>
+            <w:tcW w:w="2211" w:type="dxa"/>
             <w:tcBorders>
               <w:left w:val="single" w:sz="2" w:space="0" w:color="000000"/>
               <w:bottom w:val="single" w:sz="2" w:space="0" w:color="000000"/>
@@ -3609,7 +3609,7 @@
         <w:trPr/>
         <w:tc>
           <w:tcPr>
-            <w:tcW w:w="1585" w:type="dxa"/>
+            <w:tcW w:w="1584" w:type="dxa"/>
             <w:tcBorders>
               <w:left w:val="single" w:sz="2" w:space="0" w:color="000000"/>
               <w:bottom w:val="single" w:sz="2" w:space="0" w:color="000000"/>
@@ -3663,7 +3663,7 @@
         </w:tc>
         <w:tc>
           <w:tcPr>
-            <w:tcW w:w="2210" w:type="dxa"/>
+            <w:tcW w:w="2211" w:type="dxa"/>
             <w:tcBorders>
               <w:left w:val="single" w:sz="2" w:space="0" w:color="000000"/>
               <w:bottom w:val="single" w:sz="2" w:space="0" w:color="000000"/>
@@ -3693,7 +3693,7 @@
         <w:trPr/>
         <w:tc>
           <w:tcPr>
-            <w:tcW w:w="1585" w:type="dxa"/>
+            <w:tcW w:w="1584" w:type="dxa"/>
             <w:tcBorders>
               <w:left w:val="single" w:sz="2" w:space="0" w:color="000000"/>
               <w:bottom w:val="single" w:sz="2" w:space="0" w:color="000000"/>
@@ -3745,7 +3745,7 @@
         </w:tc>
         <w:tc>
           <w:tcPr>
-            <w:tcW w:w="2210" w:type="dxa"/>
+            <w:tcW w:w="2211" w:type="dxa"/>
             <w:tcBorders>
               <w:left w:val="single" w:sz="2" w:space="0" w:color="000000"/>
               <w:bottom w:val="single" w:sz="2" w:space="0" w:color="000000"/>
@@ -3775,7 +3775,7 @@
         <w:trPr/>
         <w:tc>
           <w:tcPr>
-            <w:tcW w:w="1585" w:type="dxa"/>
+            <w:tcW w:w="1584" w:type="dxa"/>
             <w:tcBorders>
               <w:left w:val="single" w:sz="2" w:space="0" w:color="000000"/>
               <w:bottom w:val="single" w:sz="2" w:space="0" w:color="000000"/>
@@ -3827,7 +3827,7 @@
         </w:tc>
         <w:tc>
           <w:tcPr>
-            <w:tcW w:w="2210" w:type="dxa"/>
+            <w:tcW w:w="2211" w:type="dxa"/>
             <w:tcBorders>
               <w:left w:val="single" w:sz="2" w:space="0" w:color="000000"/>
               <w:bottom w:val="single" w:sz="2" w:space="0" w:color="000000"/>
@@ -3857,7 +3857,7 @@
         <w:trPr/>
         <w:tc>
           <w:tcPr>
-            <w:tcW w:w="1585" w:type="dxa"/>
+            <w:tcW w:w="1584" w:type="dxa"/>
             <w:tcBorders>
               <w:left w:val="single" w:sz="2" w:space="0" w:color="000000"/>
               <w:bottom w:val="single" w:sz="2" w:space="0" w:color="000000"/>
@@ -3910,7 +3910,7 @@
         </w:tc>
         <w:tc>
           <w:tcPr>
-            <w:tcW w:w="2210" w:type="dxa"/>
+            <w:tcW w:w="2211" w:type="dxa"/>
             <w:tcBorders>
               <w:left w:val="single" w:sz="2" w:space="0" w:color="000000"/>
               <w:bottom w:val="single" w:sz="2" w:space="0" w:color="000000"/>
@@ -3940,7 +3940,7 @@
         <w:trPr/>
         <w:tc>
           <w:tcPr>
-            <w:tcW w:w="1585" w:type="dxa"/>
+            <w:tcW w:w="1584" w:type="dxa"/>
             <w:tcBorders>
               <w:left w:val="single" w:sz="2" w:space="0" w:color="000000"/>
               <w:bottom w:val="single" w:sz="2" w:space="0" w:color="000000"/>
@@ -3993,7 +3993,7 @@
         </w:tc>
         <w:tc>
           <w:tcPr>
-            <w:tcW w:w="2210" w:type="dxa"/>
+            <w:tcW w:w="2211" w:type="dxa"/>
             <w:tcBorders>
               <w:left w:val="single" w:sz="2" w:space="0" w:color="000000"/>
               <w:bottom w:val="single" w:sz="2" w:space="0" w:color="000000"/>
@@ -4023,7 +4023,7 @@
         <w:trPr/>
         <w:tc>
           <w:tcPr>
-            <w:tcW w:w="1585" w:type="dxa"/>
+            <w:tcW w:w="1584" w:type="dxa"/>
             <w:tcBorders>
               <w:left w:val="single" w:sz="2" w:space="0" w:color="000000"/>
               <w:bottom w:val="single" w:sz="2" w:space="0" w:color="000000"/>
@@ -4076,7 +4076,7 @@
         </w:tc>
         <w:tc>
           <w:tcPr>
-            <w:tcW w:w="2210" w:type="dxa"/>
+            <w:tcW w:w="2211" w:type="dxa"/>
             <w:tcBorders>
               <w:left w:val="single" w:sz="2" w:space="0" w:color="000000"/>
               <w:bottom w:val="single" w:sz="2" w:space="0" w:color="000000"/>
@@ -4106,7 +4106,7 @@
         <w:trPr/>
         <w:tc>
           <w:tcPr>
-            <w:tcW w:w="1585" w:type="dxa"/>
+            <w:tcW w:w="1584" w:type="dxa"/>
             <w:tcBorders>
               <w:left w:val="single" w:sz="2" w:space="0" w:color="000000"/>
               <w:bottom w:val="single" w:sz="2" w:space="0" w:color="000000"/>
@@ -4158,7 +4158,7 @@
         </w:tc>
         <w:tc>
           <w:tcPr>
-            <w:tcW w:w="2210" w:type="dxa"/>
+            <w:tcW w:w="2211" w:type="dxa"/>
             <w:tcBorders>
               <w:left w:val="single" w:sz="2" w:space="0" w:color="000000"/>
               <w:bottom w:val="single" w:sz="2" w:space="0" w:color="000000"/>
@@ -4188,7 +4188,7 @@
         <w:trPr/>
         <w:tc>
           <w:tcPr>
-            <w:tcW w:w="1585" w:type="dxa"/>
+            <w:tcW w:w="1584" w:type="dxa"/>
             <w:tcBorders>
               <w:left w:val="single" w:sz="2" w:space="0" w:color="000000"/>
               <w:bottom w:val="single" w:sz="2" w:space="0" w:color="000000"/>
@@ -4243,7 +4243,7 @@
         </w:tc>
         <w:tc>
           <w:tcPr>
-            <w:tcW w:w="2210" w:type="dxa"/>
+            <w:tcW w:w="2211" w:type="dxa"/>
             <w:tcBorders>
               <w:left w:val="single" w:sz="2" w:space="0" w:color="000000"/>
               <w:bottom w:val="single" w:sz="2" w:space="0" w:color="000000"/>
@@ -4273,7 +4273,7 @@
         <w:trPr/>
         <w:tc>
           <w:tcPr>
-            <w:tcW w:w="1585" w:type="dxa"/>
+            <w:tcW w:w="1584" w:type="dxa"/>
             <w:tcBorders>
               <w:left w:val="single" w:sz="2" w:space="0" w:color="000000"/>
               <w:bottom w:val="single" w:sz="2" w:space="0" w:color="000000"/>
@@ -4329,7 +4329,7 @@
         </w:tc>
         <w:tc>
           <w:tcPr>
-            <w:tcW w:w="2210" w:type="dxa"/>
+            <w:tcW w:w="2211" w:type="dxa"/>
             <w:tcBorders>
               <w:left w:val="single" w:sz="2" w:space="0" w:color="000000"/>
               <w:bottom w:val="single" w:sz="2" w:space="0" w:color="000000"/>
@@ -4359,7 +4359,7 @@
         <w:trPr/>
         <w:tc>
           <w:tcPr>
-            <w:tcW w:w="1585" w:type="dxa"/>
+            <w:tcW w:w="1584" w:type="dxa"/>
             <w:tcBorders>
               <w:left w:val="single" w:sz="2" w:space="0" w:color="000000"/>
               <w:bottom w:val="single" w:sz="2" w:space="0" w:color="000000"/>
@@ -4415,7 +4415,7 @@
         </w:tc>
         <w:tc>
           <w:tcPr>
-            <w:tcW w:w="2210" w:type="dxa"/>
+            <w:tcW w:w="2211" w:type="dxa"/>
             <w:tcBorders>
               <w:left w:val="single" w:sz="2" w:space="0" w:color="000000"/>
               <w:bottom w:val="single" w:sz="2" w:space="0" w:color="000000"/>
@@ -4447,7 +4447,7 @@
         <w:trPr/>
         <w:tc>
           <w:tcPr>
-            <w:tcW w:w="1585" w:type="dxa"/>
+            <w:tcW w:w="1584" w:type="dxa"/>
             <w:tcBorders>
               <w:left w:val="single" w:sz="2" w:space="0" w:color="000000"/>
               <w:bottom w:val="single" w:sz="2" w:space="0" w:color="000000"/>
@@ -4499,7 +4499,7 @@
         </w:tc>
         <w:tc>
           <w:tcPr>
-            <w:tcW w:w="2210" w:type="dxa"/>
+            <w:tcW w:w="2211" w:type="dxa"/>
             <w:tcBorders>
               <w:left w:val="single" w:sz="2" w:space="0" w:color="000000"/>
               <w:bottom w:val="single" w:sz="2" w:space="0" w:color="000000"/>
@@ -4535,7 +4535,7 @@
         <w:trPr/>
         <w:tc>
           <w:tcPr>
-            <w:tcW w:w="1585" w:type="dxa"/>
+            <w:tcW w:w="1584" w:type="dxa"/>
             <w:tcBorders>
               <w:left w:val="single" w:sz="2" w:space="0" w:color="000000"/>
               <w:bottom w:val="single" w:sz="2" w:space="0" w:color="000000"/>
@@ -4587,7 +4587,7 @@
         </w:tc>
         <w:tc>
           <w:tcPr>
-            <w:tcW w:w="2210" w:type="dxa"/>
+            <w:tcW w:w="2211" w:type="dxa"/>
             <w:tcBorders>
               <w:left w:val="single" w:sz="2" w:space="0" w:color="000000"/>
               <w:bottom w:val="single" w:sz="2" w:space="0" w:color="000000"/>
@@ -4623,7 +4623,7 @@
         <w:trPr/>
         <w:tc>
           <w:tcPr>
-            <w:tcW w:w="1585" w:type="dxa"/>
+            <w:tcW w:w="1584" w:type="dxa"/>
             <w:tcBorders>
               <w:left w:val="single" w:sz="2" w:space="0" w:color="000000"/>
               <w:bottom w:val="single" w:sz="2" w:space="0" w:color="000000"/>
@@ -4683,7 +4683,7 @@
         </w:tc>
         <w:tc>
           <w:tcPr>
-            <w:tcW w:w="2210" w:type="dxa"/>
+            <w:tcW w:w="2211" w:type="dxa"/>
             <w:tcBorders>
               <w:left w:val="single" w:sz="2" w:space="0" w:color="000000"/>
               <w:bottom w:val="single" w:sz="2" w:space="0" w:color="000000"/>
@@ -4720,7 +4720,7 @@
         <w:trPr/>
         <w:tc>
           <w:tcPr>
-            <w:tcW w:w="1585" w:type="dxa"/>
+            <w:tcW w:w="1584" w:type="dxa"/>
             <w:tcBorders>
               <w:left w:val="single" w:sz="2" w:space="0" w:color="000000"/>
               <w:bottom w:val="single" w:sz="2" w:space="0" w:color="000000"/>
@@ -4780,7 +4780,7 @@
         </w:tc>
         <w:tc>
           <w:tcPr>
-            <w:tcW w:w="2210" w:type="dxa"/>
+            <w:tcW w:w="2211" w:type="dxa"/>
             <w:tcBorders>
               <w:left w:val="single" w:sz="2" w:space="0" w:color="000000"/>
               <w:bottom w:val="single" w:sz="2" w:space="0" w:color="000000"/>
@@ -4817,7 +4817,7 @@
         <w:trPr/>
         <w:tc>
           <w:tcPr>
-            <w:tcW w:w="1585" w:type="dxa"/>
+            <w:tcW w:w="1584" w:type="dxa"/>
             <w:tcBorders>
               <w:left w:val="single" w:sz="2" w:space="0" w:color="000000"/>
               <w:bottom w:val="single" w:sz="2" w:space="0" w:color="000000"/>
@@ -4877,7 +4877,7 @@
         </w:tc>
         <w:tc>
           <w:tcPr>
-            <w:tcW w:w="2210" w:type="dxa"/>
+            <w:tcW w:w="2211" w:type="dxa"/>
             <w:tcBorders>
               <w:left w:val="single" w:sz="2" w:space="0" w:color="000000"/>
               <w:bottom w:val="single" w:sz="2" w:space="0" w:color="000000"/>
@@ -4914,7 +4914,7 @@
         <w:trPr/>
         <w:tc>
           <w:tcPr>
-            <w:tcW w:w="1585" w:type="dxa"/>
+            <w:tcW w:w="1584" w:type="dxa"/>
             <w:tcBorders>
               <w:left w:val="single" w:sz="2" w:space="0" w:color="000000"/>
               <w:bottom w:val="single" w:sz="2" w:space="0" w:color="000000"/>
@@ -4968,7 +4968,7 @@
         </w:tc>
         <w:tc>
           <w:tcPr>
-            <w:tcW w:w="2210" w:type="dxa"/>
+            <w:tcW w:w="2211" w:type="dxa"/>
             <w:tcBorders>
               <w:left w:val="single" w:sz="2" w:space="0" w:color="000000"/>
               <w:bottom w:val="single" w:sz="2" w:space="0" w:color="000000"/>
@@ -5002,7 +5002,7 @@
         <w:trPr/>
         <w:tc>
           <w:tcPr>
-            <w:tcW w:w="1585" w:type="dxa"/>
+            <w:tcW w:w="1584" w:type="dxa"/>
             <w:tcBorders>
               <w:left w:val="single" w:sz="2" w:space="0" w:color="000000"/>
               <w:bottom w:val="single" w:sz="2" w:space="0" w:color="000000"/>
@@ -5057,7 +5057,7 @@
         </w:tc>
         <w:tc>
           <w:tcPr>
-            <w:tcW w:w="2210" w:type="dxa"/>
+            <w:tcW w:w="2211" w:type="dxa"/>
             <w:tcBorders>
               <w:left w:val="single" w:sz="2" w:space="0" w:color="000000"/>
               <w:bottom w:val="single" w:sz="2" w:space="0" w:color="000000"/>
@@ -5091,7 +5091,7 @@
         <w:trPr/>
         <w:tc>
           <w:tcPr>
-            <w:tcW w:w="1585" w:type="dxa"/>
+            <w:tcW w:w="1584" w:type="dxa"/>
             <w:tcBorders>
               <w:left w:val="single" w:sz="2" w:space="0" w:color="000000"/>
               <w:bottom w:val="single" w:sz="2" w:space="0" w:color="000000"/>
@@ -5135,7 +5135,7 @@
         </w:tc>
         <w:tc>
           <w:tcPr>
-            <w:tcW w:w="2210" w:type="dxa"/>
+            <w:tcW w:w="2211" w:type="dxa"/>
             <w:tcBorders>
               <w:left w:val="single" w:sz="2" w:space="0" w:color="000000"/>
               <w:bottom w:val="single" w:sz="2" w:space="0" w:color="000000"/>
@@ -5169,7 +5169,7 @@
         <w:trPr/>
         <w:tc>
           <w:tcPr>
-            <w:tcW w:w="1585" w:type="dxa"/>
+            <w:tcW w:w="1584" w:type="dxa"/>
             <w:tcBorders>
               <w:left w:val="single" w:sz="2" w:space="0" w:color="000000"/>
               <w:bottom w:val="single" w:sz="2" w:space="0" w:color="000000"/>
@@ -5213,7 +5213,7 @@
         </w:tc>
         <w:tc>
           <w:tcPr>
-            <w:tcW w:w="2210" w:type="dxa"/>
+            <w:tcW w:w="2211" w:type="dxa"/>
             <w:tcBorders>
               <w:left w:val="single" w:sz="2" w:space="0" w:color="000000"/>
               <w:bottom w:val="single" w:sz="2" w:space="0" w:color="000000"/>
@@ -5247,7 +5247,7 @@
         <w:trPr/>
         <w:tc>
           <w:tcPr>
-            <w:tcW w:w="1585" w:type="dxa"/>
+            <w:tcW w:w="1584" w:type="dxa"/>
             <w:tcBorders>
               <w:left w:val="single" w:sz="2" w:space="0" w:color="000000"/>
               <w:bottom w:val="single" w:sz="2" w:space="0" w:color="000000"/>
@@ -5296,7 +5296,7 @@
         </w:tc>
         <w:tc>
           <w:tcPr>
-            <w:tcW w:w="2210" w:type="dxa"/>
+            <w:tcW w:w="2211" w:type="dxa"/>
             <w:tcBorders>
               <w:left w:val="single" w:sz="2" w:space="0" w:color="000000"/>
               <w:bottom w:val="single" w:sz="2" w:space="0" w:color="000000"/>
@@ -5326,7 +5326,7 @@
         <w:trPr/>
         <w:tc>
           <w:tcPr>
-            <w:tcW w:w="1585" w:type="dxa"/>
+            <w:tcW w:w="1584" w:type="dxa"/>
             <w:tcBorders>
               <w:left w:val="single" w:sz="2" w:space="0" w:color="000000"/>
               <w:bottom w:val="single" w:sz="2" w:space="0" w:color="000000"/>
@@ -5376,7 +5376,7 @@
         </w:tc>
         <w:tc>
           <w:tcPr>
-            <w:tcW w:w="2210" w:type="dxa"/>
+            <w:tcW w:w="2211" w:type="dxa"/>
             <w:tcBorders>
               <w:left w:val="single" w:sz="2" w:space="0" w:color="000000"/>
               <w:bottom w:val="single" w:sz="2" w:space="0" w:color="000000"/>
@@ -5408,7 +5408,7 @@
         <w:trPr/>
         <w:tc>
           <w:tcPr>
-            <w:tcW w:w="1585" w:type="dxa"/>
+            <w:tcW w:w="1584" w:type="dxa"/>
             <w:tcBorders>
               <w:left w:val="single" w:sz="2" w:space="0" w:color="000000"/>
               <w:bottom w:val="single" w:sz="2" w:space="0" w:color="000000"/>
@@ -5464,7 +5464,7 @@
         </w:tc>
         <w:tc>
           <w:tcPr>
-            <w:tcW w:w="2210" w:type="dxa"/>
+            <w:tcW w:w="2211" w:type="dxa"/>
             <w:tcBorders>
               <w:left w:val="single" w:sz="2" w:space="0" w:color="000000"/>
               <w:bottom w:val="single" w:sz="2" w:space="0" w:color="000000"/>
@@ -5496,7 +5496,7 @@
         <w:trPr/>
         <w:tc>
           <w:tcPr>
-            <w:tcW w:w="1585" w:type="dxa"/>
+            <w:tcW w:w="1584" w:type="dxa"/>
             <w:tcBorders>
               <w:left w:val="single" w:sz="2" w:space="0" w:color="000000"/>
               <w:bottom w:val="single" w:sz="2" w:space="0" w:color="000000"/>
@@ -5546,7 +5546,7 @@
         </w:tc>
         <w:tc>
           <w:tcPr>
-            <w:tcW w:w="2210" w:type="dxa"/>
+            <w:tcW w:w="2211" w:type="dxa"/>
             <w:tcBorders>
               <w:left w:val="single" w:sz="2" w:space="0" w:color="000000"/>
               <w:bottom w:val="single" w:sz="2" w:space="0" w:color="000000"/>
@@ -5578,7 +5578,7 @@
         <w:trPr/>
         <w:tc>
           <w:tcPr>
-            <w:tcW w:w="1585" w:type="dxa"/>
+            <w:tcW w:w="1584" w:type="dxa"/>
             <w:tcBorders>
               <w:left w:val="single" w:sz="2" w:space="0" w:color="000000"/>
               <w:bottom w:val="single" w:sz="2" w:space="0" w:color="000000"/>
@@ -5628,7 +5628,7 @@
         </w:tc>
         <w:tc>
           <w:tcPr>
-            <w:tcW w:w="2210" w:type="dxa"/>
+            <w:tcW w:w="2211" w:type="dxa"/>
             <w:tcBorders>
               <w:left w:val="single" w:sz="2" w:space="0" w:color="000000"/>
               <w:bottom w:val="single" w:sz="2" w:space="0" w:color="000000"/>
@@ -5660,7 +5660,7 @@
         <w:trPr/>
         <w:tc>
           <w:tcPr>
-            <w:tcW w:w="1585" w:type="dxa"/>
+            <w:tcW w:w="1584" w:type="dxa"/>
             <w:tcBorders>
               <w:left w:val="single" w:sz="2" w:space="0" w:color="000000"/>
               <w:bottom w:val="single" w:sz="2" w:space="0" w:color="000000"/>
@@ -5710,7 +5710,7 @@
         </w:tc>
         <w:tc>
           <w:tcPr>
-            <w:tcW w:w="2210" w:type="dxa"/>
+            <w:tcW w:w="2211" w:type="dxa"/>
             <w:tcBorders>
               <w:left w:val="single" w:sz="2" w:space="0" w:color="000000"/>
               <w:bottom w:val="single" w:sz="2" w:space="0" w:color="000000"/>
@@ -5742,7 +5742,7 @@
         <w:trPr/>
         <w:tc>
           <w:tcPr>
-            <w:tcW w:w="1585" w:type="dxa"/>
+            <w:tcW w:w="1584" w:type="dxa"/>
             <w:tcBorders>
               <w:left w:val="single" w:sz="2" w:space="0" w:color="000000"/>
               <w:bottom w:val="single" w:sz="2" w:space="0" w:color="000000"/>
@@ -5796,7 +5796,7 @@
         </w:tc>
         <w:tc>
           <w:tcPr>
-            <w:tcW w:w="2210" w:type="dxa"/>
+            <w:tcW w:w="2211" w:type="dxa"/>
             <w:tcBorders>
               <w:left w:val="single" w:sz="2" w:space="0" w:color="000000"/>
               <w:bottom w:val="single" w:sz="2" w:space="0" w:color="000000"/>
@@ -5828,7 +5828,7 @@
         <w:trPr/>
         <w:tc>
           <w:tcPr>
-            <w:tcW w:w="1585" w:type="dxa"/>
+            <w:tcW w:w="1584" w:type="dxa"/>
             <w:tcBorders>
               <w:left w:val="single" w:sz="2" w:space="0" w:color="000000"/>
               <w:bottom w:val="single" w:sz="2" w:space="0" w:color="000000"/>
@@ -5969,7 +5969,7 @@
         </w:tc>
         <w:tc>
           <w:tcPr>
-            <w:tcW w:w="2210" w:type="dxa"/>
+            <w:tcW w:w="2211" w:type="dxa"/>
             <w:tcBorders>
               <w:left w:val="single" w:sz="2" w:space="0" w:color="000000"/>
               <w:bottom w:val="single" w:sz="2" w:space="0" w:color="000000"/>
@@ -6001,7 +6001,7 @@
         <w:trPr/>
         <w:tc>
           <w:tcPr>
-            <w:tcW w:w="1585" w:type="dxa"/>
+            <w:tcW w:w="1584" w:type="dxa"/>
             <w:tcBorders>
               <w:left w:val="single" w:sz="2" w:space="0" w:color="000000"/>
               <w:bottom w:val="single" w:sz="2" w:space="0" w:color="000000"/>
@@ -6101,7 +6101,7 @@
         </w:tc>
         <w:tc>
           <w:tcPr>
-            <w:tcW w:w="2210" w:type="dxa"/>
+            <w:tcW w:w="2211" w:type="dxa"/>
             <w:tcBorders>
               <w:left w:val="single" w:sz="2" w:space="0" w:color="000000"/>
               <w:bottom w:val="single" w:sz="2" w:space="0" w:color="000000"/>
@@ -7309,15 +7309,15 @@
         </w:tblCellMar>
       </w:tblPr>
       <w:tblGrid>
-        <w:gridCol w:w="3234"/>
+        <w:gridCol w:w="3233"/>
         <w:gridCol w:w="2309"/>
-        <w:gridCol w:w="3412"/>
+        <w:gridCol w:w="3413"/>
       </w:tblGrid>
       <w:tr>
         <w:trPr/>
         <w:tc>
           <w:tcPr>
-            <w:tcW w:w="3234" w:type="dxa"/>
+            <w:tcW w:w="3233" w:type="dxa"/>
             <w:tcBorders/>
             <w:shd w:fill="auto" w:val="clear"/>
           </w:tcPr>
@@ -7359,7 +7359,7 @@
         </w:tc>
         <w:tc>
           <w:tcPr>
-            <w:tcW w:w="3412" w:type="dxa"/>
+            <w:tcW w:w="3413" w:type="dxa"/>
             <w:tcBorders/>
             <w:shd w:fill="auto" w:val="clear"/>
           </w:tcPr>
@@ -7383,7 +7383,7 @@
         <w:trPr/>
         <w:tc>
           <w:tcPr>
-            <w:tcW w:w="3234" w:type="dxa"/>
+            <w:tcW w:w="3233" w:type="dxa"/>
             <w:tcBorders/>
             <w:shd w:fill="auto" w:val="clear"/>
           </w:tcPr>
@@ -7426,7 +7426,7 @@
         </w:tc>
         <w:tc>
           <w:tcPr>
-            <w:tcW w:w="3412" w:type="dxa"/>
+            <w:tcW w:w="3413" w:type="dxa"/>
             <w:tcBorders/>
             <w:shd w:fill="auto" w:val="clear"/>
           </w:tcPr>
@@ -7475,7 +7475,7 @@
         <w:trPr/>
         <w:tc>
           <w:tcPr>
-            <w:tcW w:w="3234" w:type="dxa"/>
+            <w:tcW w:w="3233" w:type="dxa"/>
             <w:tcBorders/>
             <w:shd w:fill="auto" w:val="clear"/>
           </w:tcPr>
@@ -7534,7 +7534,7 @@
         </w:tc>
         <w:tc>
           <w:tcPr>
-            <w:tcW w:w="3412" w:type="dxa"/>
+            <w:tcW w:w="3413" w:type="dxa"/>
             <w:tcBorders/>
             <w:shd w:fill="auto" w:val="clear"/>
           </w:tcPr>
@@ -7560,7 +7560,7 @@
         <w:trPr/>
         <w:tc>
           <w:tcPr>
-            <w:tcW w:w="3234" w:type="dxa"/>
+            <w:tcW w:w="3233" w:type="dxa"/>
             <w:tcBorders/>
             <w:shd w:fill="auto" w:val="clear"/>
           </w:tcPr>
@@ -7603,7 +7603,7 @@
         </w:tc>
         <w:tc>
           <w:tcPr>
-            <w:tcW w:w="3412" w:type="dxa"/>
+            <w:tcW w:w="3413" w:type="dxa"/>
             <w:tcBorders/>
             <w:shd w:fill="auto" w:val="clear"/>
           </w:tcPr>
@@ -7629,7 +7629,7 @@
         <w:trPr/>
         <w:tc>
           <w:tcPr>
-            <w:tcW w:w="3234" w:type="dxa"/>
+            <w:tcW w:w="3233" w:type="dxa"/>
             <w:tcBorders/>
             <w:shd w:fill="auto" w:val="clear"/>
           </w:tcPr>
@@ -7672,7 +7672,7 @@
         </w:tc>
         <w:tc>
           <w:tcPr>
-            <w:tcW w:w="3412" w:type="dxa"/>
+            <w:tcW w:w="3413" w:type="dxa"/>
             <w:tcBorders/>
             <w:shd w:fill="auto" w:val="clear"/>
           </w:tcPr>
@@ -7698,7 +7698,7 @@
         <w:trPr/>
         <w:tc>
           <w:tcPr>
-            <w:tcW w:w="3234" w:type="dxa"/>
+            <w:tcW w:w="3233" w:type="dxa"/>
             <w:tcBorders/>
             <w:shd w:fill="auto" w:val="clear"/>
           </w:tcPr>
@@ -7744,7 +7744,7 @@
         </w:tc>
         <w:tc>
           <w:tcPr>
-            <w:tcW w:w="3412" w:type="dxa"/>
+            <w:tcW w:w="3413" w:type="dxa"/>
             <w:tcBorders/>
             <w:shd w:fill="auto" w:val="clear"/>
           </w:tcPr>
@@ -7868,15 +7868,15 @@
         </w:tblCellMar>
       </w:tblPr>
       <w:tblGrid>
-        <w:gridCol w:w="3234"/>
+        <w:gridCol w:w="3233"/>
         <w:gridCol w:w="2339"/>
-        <w:gridCol w:w="3442"/>
+        <w:gridCol w:w="3443"/>
       </w:tblGrid>
       <w:tr>
         <w:trPr/>
         <w:tc>
           <w:tcPr>
-            <w:tcW w:w="3234" w:type="dxa"/>
+            <w:tcW w:w="3233" w:type="dxa"/>
             <w:tcBorders/>
             <w:shd w:fill="auto" w:val="clear"/>
           </w:tcPr>
@@ -7922,7 +7922,7 @@
         </w:tc>
         <w:tc>
           <w:tcPr>
-            <w:tcW w:w="3442" w:type="dxa"/>
+            <w:tcW w:w="3443" w:type="dxa"/>
             <w:tcBorders/>
             <w:shd w:fill="auto" w:val="clear"/>
           </w:tcPr>
@@ -7948,7 +7948,7 @@
         <w:trPr/>
         <w:tc>
           <w:tcPr>
-            <w:tcW w:w="3234" w:type="dxa"/>
+            <w:tcW w:w="3233" w:type="dxa"/>
             <w:tcBorders/>
             <w:shd w:fill="auto" w:val="clear"/>
           </w:tcPr>
@@ -7994,7 +7994,7 @@
         </w:tc>
         <w:tc>
           <w:tcPr>
-            <w:tcW w:w="3442" w:type="dxa"/>
+            <w:tcW w:w="3443" w:type="dxa"/>
             <w:tcBorders/>
             <w:shd w:fill="auto" w:val="clear"/>
           </w:tcPr>
@@ -8415,14 +8415,14 @@
         </w:tblCellMar>
       </w:tblPr>
       <w:tblGrid>
-        <w:gridCol w:w="1795"/>
-        <w:gridCol w:w="7159"/>
+        <w:gridCol w:w="1794"/>
+        <w:gridCol w:w="7160"/>
       </w:tblGrid>
       <w:tr>
         <w:trPr/>
         <w:tc>
           <w:tcPr>
-            <w:tcW w:w="1795" w:type="dxa"/>
+            <w:tcW w:w="1794" w:type="dxa"/>
             <w:tcBorders/>
             <w:shd w:fill="auto" w:val="clear"/>
           </w:tcPr>
@@ -8445,7 +8445,7 @@
         </w:tc>
         <w:tc>
           <w:tcPr>
-            <w:tcW w:w="7159" w:type="dxa"/>
+            <w:tcW w:w="7160" w:type="dxa"/>
             <w:tcBorders/>
             <w:shd w:fill="auto" w:val="clear"/>
           </w:tcPr>
@@ -8471,7 +8471,7 @@
         <w:trPr/>
         <w:tc>
           <w:tcPr>
-            <w:tcW w:w="1795" w:type="dxa"/>
+            <w:tcW w:w="1794" w:type="dxa"/>
             <w:tcBorders/>
             <w:shd w:fill="auto" w:val="clear"/>
           </w:tcPr>
@@ -8492,7 +8492,7 @@
         </w:tc>
         <w:tc>
           <w:tcPr>
-            <w:tcW w:w="7159" w:type="dxa"/>
+            <w:tcW w:w="7160" w:type="dxa"/>
             <w:tcBorders/>
             <w:shd w:fill="auto" w:val="clear"/>
           </w:tcPr>
@@ -8514,7 +8514,7 @@
         <w:trPr/>
         <w:tc>
           <w:tcPr>
-            <w:tcW w:w="1795" w:type="dxa"/>
+            <w:tcW w:w="1794" w:type="dxa"/>
             <w:tcBorders/>
             <w:shd w:fill="auto" w:val="clear"/>
           </w:tcPr>
@@ -8535,7 +8535,7 @@
         </w:tc>
         <w:tc>
           <w:tcPr>
-            <w:tcW w:w="7159" w:type="dxa"/>
+            <w:tcW w:w="7160" w:type="dxa"/>
             <w:tcBorders/>
             <w:shd w:fill="auto" w:val="clear"/>
           </w:tcPr>
@@ -8559,7 +8559,7 @@
         <w:trPr/>
         <w:tc>
           <w:tcPr>
-            <w:tcW w:w="1795" w:type="dxa"/>
+            <w:tcW w:w="1794" w:type="dxa"/>
             <w:tcBorders/>
             <w:shd w:fill="auto" w:val="clear"/>
           </w:tcPr>
@@ -8580,7 +8580,7 @@
         </w:tc>
         <w:tc>
           <w:tcPr>
-            <w:tcW w:w="7159" w:type="dxa"/>
+            <w:tcW w:w="7160" w:type="dxa"/>
             <w:tcBorders/>
             <w:shd w:fill="auto" w:val="clear"/>
           </w:tcPr>
@@ -8606,7 +8606,7 @@
         </w:trPr>
         <w:tc>
           <w:tcPr>
-            <w:tcW w:w="1795" w:type="dxa"/>
+            <w:tcW w:w="1794" w:type="dxa"/>
             <w:tcBorders/>
             <w:shd w:fill="auto" w:val="clear"/>
           </w:tcPr>
@@ -8627,7 +8627,7 @@
         </w:tc>
         <w:tc>
           <w:tcPr>
-            <w:tcW w:w="7159" w:type="dxa"/>
+            <w:tcW w:w="7160" w:type="dxa"/>
             <w:tcBorders/>
             <w:shd w:fill="auto" w:val="clear"/>
           </w:tcPr>
@@ -8651,7 +8651,7 @@
         <w:trPr/>
         <w:tc>
           <w:tcPr>
-            <w:tcW w:w="1795" w:type="dxa"/>
+            <w:tcW w:w="1794" w:type="dxa"/>
             <w:tcBorders/>
             <w:shd w:fill="auto" w:val="clear"/>
           </w:tcPr>
@@ -8672,7 +8672,7 @@
         </w:tc>
         <w:tc>
           <w:tcPr>
-            <w:tcW w:w="7159" w:type="dxa"/>
+            <w:tcW w:w="7160" w:type="dxa"/>
             <w:tcBorders/>
             <w:shd w:fill="auto" w:val="clear"/>
           </w:tcPr>
@@ -8694,7 +8694,7 @@
         <w:trPr/>
         <w:tc>
           <w:tcPr>
-            <w:tcW w:w="1795" w:type="dxa"/>
+            <w:tcW w:w="1794" w:type="dxa"/>
             <w:tcBorders/>
             <w:shd w:fill="auto" w:val="clear"/>
           </w:tcPr>
@@ -8715,7 +8715,7 @@
         </w:tc>
         <w:tc>
           <w:tcPr>
-            <w:tcW w:w="7159" w:type="dxa"/>
+            <w:tcW w:w="7160" w:type="dxa"/>
             <w:tcBorders/>
             <w:shd w:fill="auto" w:val="clear"/>
           </w:tcPr>
@@ -8753,7 +8753,7 @@
         <w:trPr/>
         <w:tc>
           <w:tcPr>
-            <w:tcW w:w="1795" w:type="dxa"/>
+            <w:tcW w:w="1794" w:type="dxa"/>
             <w:tcBorders/>
             <w:shd w:fill="auto" w:val="clear"/>
           </w:tcPr>
@@ -8774,7 +8774,7 @@
         </w:tc>
         <w:tc>
           <w:tcPr>
-            <w:tcW w:w="7159" w:type="dxa"/>
+            <w:tcW w:w="7160" w:type="dxa"/>
             <w:tcBorders/>
             <w:shd w:fill="auto" w:val="clear"/>
           </w:tcPr>
@@ -8873,14 +8873,14 @@
         </w:tblCellMar>
       </w:tblPr>
       <w:tblGrid>
-        <w:gridCol w:w="2204"/>
-        <w:gridCol w:w="7440"/>
+        <w:gridCol w:w="2203"/>
+        <w:gridCol w:w="7441"/>
       </w:tblGrid>
       <w:tr>
         <w:trPr/>
         <w:tc>
           <w:tcPr>
-            <w:tcW w:w="2204" w:type="dxa"/>
+            <w:tcW w:w="2203" w:type="dxa"/>
             <w:tcBorders/>
             <w:shd w:fill="auto" w:val="clear"/>
           </w:tcPr>
@@ -8899,7 +8899,7 @@
         </w:tc>
         <w:tc>
           <w:tcPr>
-            <w:tcW w:w="7440" w:type="dxa"/>
+            <w:tcW w:w="7441" w:type="dxa"/>
             <w:tcBorders/>
             <w:shd w:fill="auto" w:val="clear"/>
           </w:tcPr>
@@ -8923,7 +8923,7 @@
         <w:trPr/>
         <w:tc>
           <w:tcPr>
-            <w:tcW w:w="2204" w:type="dxa"/>
+            <w:tcW w:w="2203" w:type="dxa"/>
             <w:tcBorders/>
             <w:shd w:fill="auto" w:val="clear"/>
           </w:tcPr>
@@ -8942,7 +8942,7 @@
         </w:tc>
         <w:tc>
           <w:tcPr>
-            <w:tcW w:w="7440" w:type="dxa"/>
+            <w:tcW w:w="7441" w:type="dxa"/>
             <w:tcBorders/>
             <w:shd w:fill="auto" w:val="clear"/>
           </w:tcPr>
@@ -8964,7 +8964,7 @@
         <w:trPr/>
         <w:tc>
           <w:tcPr>
-            <w:tcW w:w="2204" w:type="dxa"/>
+            <w:tcW w:w="2203" w:type="dxa"/>
             <w:tcBorders/>
             <w:shd w:fill="auto" w:val="clear"/>
           </w:tcPr>
@@ -8983,7 +8983,7 @@
         </w:tc>
         <w:tc>
           <w:tcPr>
-            <w:tcW w:w="7440" w:type="dxa"/>
+            <w:tcW w:w="7441" w:type="dxa"/>
             <w:tcBorders/>
             <w:shd w:fill="auto" w:val="clear"/>
           </w:tcPr>
@@ -9005,7 +9005,7 @@
         <w:trPr/>
         <w:tc>
           <w:tcPr>
-            <w:tcW w:w="2204" w:type="dxa"/>
+            <w:tcW w:w="2203" w:type="dxa"/>
             <w:tcBorders/>
             <w:shd w:fill="auto" w:val="clear"/>
           </w:tcPr>
@@ -9024,7 +9024,7 @@
         </w:tc>
         <w:tc>
           <w:tcPr>
-            <w:tcW w:w="7440" w:type="dxa"/>
+            <w:tcW w:w="7441" w:type="dxa"/>
             <w:tcBorders/>
             <w:shd w:fill="auto" w:val="clear"/>
           </w:tcPr>
@@ -9130,8 +9130,8 @@
         </w:tblCellMar>
       </w:tblPr>
       <w:tblGrid>
-        <w:gridCol w:w="2263"/>
-        <w:gridCol w:w="6691"/>
+        <w:gridCol w:w="2262"/>
+        <w:gridCol w:w="6692"/>
       </w:tblGrid>
       <w:tr>
         <w:trPr>
@@ -9139,7 +9139,7 @@
         </w:trPr>
         <w:tc>
           <w:tcPr>
-            <w:tcW w:w="2263" w:type="dxa"/>
+            <w:tcW w:w="2262" w:type="dxa"/>
             <w:tcBorders/>
             <w:shd w:fill="auto" w:val="clear"/>
           </w:tcPr>
@@ -9162,7 +9162,7 @@
         </w:tc>
         <w:tc>
           <w:tcPr>
-            <w:tcW w:w="6691" w:type="dxa"/>
+            <w:tcW w:w="6692" w:type="dxa"/>
             <w:tcBorders/>
             <w:shd w:fill="auto" w:val="clear"/>
           </w:tcPr>
@@ -9187,7 +9187,7 @@
         <w:trPr/>
         <w:tc>
           <w:tcPr>
-            <w:tcW w:w="2263" w:type="dxa"/>
+            <w:tcW w:w="2262" w:type="dxa"/>
             <w:tcBorders/>
             <w:shd w:fill="auto" w:val="clear"/>
           </w:tcPr>
@@ -9209,7 +9209,7 @@
         </w:tc>
         <w:tc>
           <w:tcPr>
-            <w:tcW w:w="6691" w:type="dxa"/>
+            <w:tcW w:w="6692" w:type="dxa"/>
             <w:tcBorders/>
             <w:shd w:fill="auto" w:val="clear"/>
           </w:tcPr>
@@ -9233,7 +9233,7 @@
         <w:trPr/>
         <w:tc>
           <w:tcPr>
-            <w:tcW w:w="2263" w:type="dxa"/>
+            <w:tcW w:w="2262" w:type="dxa"/>
             <w:tcBorders/>
             <w:shd w:fill="auto" w:val="clear"/>
           </w:tcPr>
@@ -9253,7 +9253,7 @@
         </w:tc>
         <w:tc>
           <w:tcPr>
-            <w:tcW w:w="6691" w:type="dxa"/>
+            <w:tcW w:w="6692" w:type="dxa"/>
             <w:tcBorders/>
             <w:shd w:fill="auto" w:val="clear"/>
           </w:tcPr>
@@ -9277,7 +9277,7 @@
         <w:trPr/>
         <w:tc>
           <w:tcPr>
-            <w:tcW w:w="2263" w:type="dxa"/>
+            <w:tcW w:w="2262" w:type="dxa"/>
             <w:tcBorders/>
             <w:shd w:fill="auto" w:val="clear"/>
           </w:tcPr>
@@ -9299,7 +9299,7 @@
         </w:tc>
         <w:tc>
           <w:tcPr>
-            <w:tcW w:w="6691" w:type="dxa"/>
+            <w:tcW w:w="6692" w:type="dxa"/>
             <w:tcBorders/>
             <w:shd w:fill="auto" w:val="clear"/>
           </w:tcPr>
@@ -9321,7 +9321,7 @@
         <w:trPr/>
         <w:tc>
           <w:tcPr>
-            <w:tcW w:w="2263" w:type="dxa"/>
+            <w:tcW w:w="2262" w:type="dxa"/>
             <w:tcBorders/>
             <w:shd w:fill="auto" w:val="clear"/>
           </w:tcPr>
@@ -9343,7 +9343,7 @@
         </w:tc>
         <w:tc>
           <w:tcPr>
-            <w:tcW w:w="6691" w:type="dxa"/>
+            <w:tcW w:w="6692" w:type="dxa"/>
             <w:tcBorders/>
             <w:shd w:fill="auto" w:val="clear"/>
           </w:tcPr>
@@ -9367,7 +9367,7 @@
         <w:trPr/>
         <w:tc>
           <w:tcPr>
-            <w:tcW w:w="2263" w:type="dxa"/>
+            <w:tcW w:w="2262" w:type="dxa"/>
             <w:tcBorders/>
             <w:shd w:fill="auto" w:val="clear"/>
           </w:tcPr>
@@ -9387,7 +9387,7 @@
         </w:tc>
         <w:tc>
           <w:tcPr>
-            <w:tcW w:w="6691" w:type="dxa"/>
+            <w:tcW w:w="6692" w:type="dxa"/>
             <w:tcBorders/>
             <w:shd w:fill="auto" w:val="clear"/>
           </w:tcPr>
@@ -9413,7 +9413,7 @@
         <w:trPr/>
         <w:tc>
           <w:tcPr>
-            <w:tcW w:w="2263" w:type="dxa"/>
+            <w:tcW w:w="2262" w:type="dxa"/>
             <w:tcBorders/>
             <w:shd w:fill="auto" w:val="clear"/>
           </w:tcPr>
@@ -9435,7 +9435,7 @@
         </w:tc>
         <w:tc>
           <w:tcPr>
-            <w:tcW w:w="6691" w:type="dxa"/>
+            <w:tcW w:w="6692" w:type="dxa"/>
             <w:tcBorders/>
             <w:shd w:fill="auto" w:val="clear"/>
           </w:tcPr>
@@ -9459,7 +9459,7 @@
         <w:trPr/>
         <w:tc>
           <w:tcPr>
-            <w:tcW w:w="2263" w:type="dxa"/>
+            <w:tcW w:w="2262" w:type="dxa"/>
             <w:tcBorders/>
             <w:shd w:fill="auto" w:val="clear"/>
           </w:tcPr>
@@ -9479,7 +9479,7 @@
         </w:tc>
         <w:tc>
           <w:tcPr>
-            <w:tcW w:w="6691" w:type="dxa"/>
+            <w:tcW w:w="6692" w:type="dxa"/>
             <w:tcBorders/>
             <w:shd w:fill="auto" w:val="clear"/>
           </w:tcPr>
@@ -9503,7 +9503,7 @@
         <w:trPr/>
         <w:tc>
           <w:tcPr>
-            <w:tcW w:w="2263" w:type="dxa"/>
+            <w:tcW w:w="2262" w:type="dxa"/>
             <w:tcBorders/>
             <w:shd w:fill="auto" w:val="clear"/>
           </w:tcPr>
@@ -9524,7 +9524,7 @@
         </w:tc>
         <w:tc>
           <w:tcPr>
-            <w:tcW w:w="6691" w:type="dxa"/>
+            <w:tcW w:w="6692" w:type="dxa"/>
             <w:tcBorders/>
             <w:shd w:fill="auto" w:val="clear"/>
           </w:tcPr>
@@ -10236,8 +10236,27 @@
       <w:r>
         <w:rPr>
           <w:rFonts w:ascii="Verdana" w:hAnsi="Verdana"/>
-        </w:rPr>
-        <w:t>PIL-NED splits the line i the note list i single parts, starting by the first part..</w:t>
+          <w:lang w:val="da-DK"/>
+        </w:rPr>
+        <w:t>ARROW</w:t>
+      </w:r>
+      <w:r>
+        <w:rPr>
+          <w:rFonts w:ascii="Verdana" w:hAnsi="Verdana"/>
+        </w:rPr>
+        <w:t>-</w:t>
+      </w:r>
+      <w:r>
+        <w:rPr>
+          <w:rFonts w:ascii="Verdana" w:hAnsi="Verdana"/>
+        </w:rPr>
+        <w:t>DOWN</w:t>
+      </w:r>
+      <w:r>
+        <w:rPr>
+          <w:rFonts w:ascii="Verdana" w:hAnsi="Verdana"/>
+        </w:rPr>
+        <w:t xml:space="preserve"> splits the line i the note list i single parts, starting by the first part..</w:t>
       </w:r>
     </w:p>
     <w:p>
@@ -10255,8 +10274,27 @@
       <w:r>
         <w:rPr>
           <w:rFonts w:ascii="Verdana" w:hAnsi="Verdana"/>
-        </w:rPr>
-        <w:t>PIL-OP stlits the line in the note list in single parts, starting by the last part.</w:t>
+          <w:lang w:val="da-DK"/>
+        </w:rPr>
+        <w:t>ARROW</w:t>
+      </w:r>
+      <w:r>
+        <w:rPr>
+          <w:rFonts w:ascii="Verdana" w:hAnsi="Verdana"/>
+        </w:rPr>
+        <w:t>-</w:t>
+      </w:r>
+      <w:r>
+        <w:rPr>
+          <w:rFonts w:ascii="Verdana" w:hAnsi="Verdana"/>
+        </w:rPr>
+        <w:t>UP</w:t>
+      </w:r>
+      <w:r>
+        <w:rPr>
+          <w:rFonts w:ascii="Verdana" w:hAnsi="Verdana"/>
+        </w:rPr>
+        <w:t xml:space="preserve"> stlits the line in the note list in single parts, starting by the last part.</w:t>
       </w:r>
     </w:p>
     <w:p>
@@ -11556,14 +11594,14 @@
         </w:tblCellMar>
       </w:tblPr>
       <w:tblGrid>
-        <w:gridCol w:w="2606"/>
-        <w:gridCol w:w="6419"/>
+        <w:gridCol w:w="2605"/>
+        <w:gridCol w:w="6420"/>
       </w:tblGrid>
       <w:tr>
         <w:trPr/>
         <w:tc>
           <w:tcPr>
-            <w:tcW w:w="2606" w:type="dxa"/>
+            <w:tcW w:w="2605" w:type="dxa"/>
             <w:tcBorders>
               <w:top w:val="single" w:sz="4" w:space="0" w:color="000000"/>
               <w:left w:val="single" w:sz="4" w:space="0" w:color="000000"/>
@@ -11615,7 +11653,7 @@
         </w:tc>
         <w:tc>
           <w:tcPr>
-            <w:tcW w:w="6419" w:type="dxa"/>
+            <w:tcW w:w="6420" w:type="dxa"/>
             <w:tcBorders>
               <w:top w:val="single" w:sz="4" w:space="0" w:color="000000"/>
               <w:left w:val="single" w:sz="4" w:space="0" w:color="000000"/>
@@ -11671,7 +11709,7 @@
         <w:trPr/>
         <w:tc>
           <w:tcPr>
-            <w:tcW w:w="2606" w:type="dxa"/>
+            <w:tcW w:w="2605" w:type="dxa"/>
             <w:tcBorders>
               <w:left w:val="single" w:sz="4" w:space="0" w:color="000000"/>
               <w:bottom w:val="single" w:sz="4" w:space="0" w:color="000000"/>
@@ -11722,7 +11760,7 @@
         </w:tc>
         <w:tc>
           <w:tcPr>
-            <w:tcW w:w="6419" w:type="dxa"/>
+            <w:tcW w:w="6420" w:type="dxa"/>
             <w:tcBorders>
               <w:left w:val="single" w:sz="4" w:space="0" w:color="000000"/>
               <w:bottom w:val="single" w:sz="4" w:space="0" w:color="000000"/>
@@ -11777,7 +11815,7 @@
         <w:trPr/>
         <w:tc>
           <w:tcPr>
-            <w:tcW w:w="2606" w:type="dxa"/>
+            <w:tcW w:w="2605" w:type="dxa"/>
             <w:tcBorders>
               <w:left w:val="single" w:sz="4" w:space="0" w:color="000000"/>
               <w:bottom w:val="single" w:sz="4" w:space="0" w:color="000000"/>
@@ -11828,7 +11866,7 @@
         </w:tc>
         <w:tc>
           <w:tcPr>
-            <w:tcW w:w="6419" w:type="dxa"/>
+            <w:tcW w:w="6420" w:type="dxa"/>
             <w:tcBorders>
               <w:left w:val="single" w:sz="4" w:space="0" w:color="000000"/>
               <w:bottom w:val="single" w:sz="4" w:space="0" w:color="000000"/>
@@ -15265,14 +15303,14 @@
         </w:tblCellMar>
       </w:tblPr>
       <w:tblGrid>
-        <w:gridCol w:w="2155"/>
-        <w:gridCol w:w="6799"/>
+        <w:gridCol w:w="2154"/>
+        <w:gridCol w:w="6800"/>
       </w:tblGrid>
       <w:tr>
         <w:trPr/>
         <w:tc>
           <w:tcPr>
-            <w:tcW w:w="2155" w:type="dxa"/>
+            <w:tcW w:w="2154" w:type="dxa"/>
             <w:tcBorders/>
             <w:shd w:fill="auto" w:val="clear"/>
           </w:tcPr>
@@ -15297,7 +15335,7 @@
         </w:tc>
         <w:tc>
           <w:tcPr>
-            <w:tcW w:w="6799" w:type="dxa"/>
+            <w:tcW w:w="6800" w:type="dxa"/>
             <w:tcBorders/>
             <w:shd w:fill="auto" w:val="clear"/>
           </w:tcPr>
@@ -15323,7 +15361,7 @@
         <w:trPr/>
         <w:tc>
           <w:tcPr>
-            <w:tcW w:w="2155" w:type="dxa"/>
+            <w:tcW w:w="2154" w:type="dxa"/>
             <w:tcBorders/>
             <w:shd w:fill="auto" w:val="clear"/>
           </w:tcPr>
@@ -15344,7 +15382,7 @@
         </w:tc>
         <w:tc>
           <w:tcPr>
-            <w:tcW w:w="6799" w:type="dxa"/>
+            <w:tcW w:w="6800" w:type="dxa"/>
             <w:tcBorders/>
             <w:shd w:fill="auto" w:val="clear"/>
           </w:tcPr>
@@ -15368,7 +15406,7 @@
         <w:trPr/>
         <w:tc>
           <w:tcPr>
-            <w:tcW w:w="2155" w:type="dxa"/>
+            <w:tcW w:w="2154" w:type="dxa"/>
             <w:tcBorders/>
             <w:shd w:fill="auto" w:val="clear"/>
           </w:tcPr>
@@ -15391,7 +15429,7 @@
         </w:tc>
         <w:tc>
           <w:tcPr>
-            <w:tcW w:w="6799" w:type="dxa"/>
+            <w:tcW w:w="6800" w:type="dxa"/>
             <w:tcBorders/>
             <w:shd w:fill="auto" w:val="clear"/>
           </w:tcPr>
@@ -15415,7 +15453,7 @@
         <w:trPr/>
         <w:tc>
           <w:tcPr>
-            <w:tcW w:w="2155" w:type="dxa"/>
+            <w:tcW w:w="2154" w:type="dxa"/>
             <w:tcBorders/>
             <w:shd w:fill="auto" w:val="clear"/>
           </w:tcPr>
@@ -15438,7 +15476,7 @@
         </w:tc>
         <w:tc>
           <w:tcPr>
-            <w:tcW w:w="6799" w:type="dxa"/>
+            <w:tcW w:w="6800" w:type="dxa"/>
             <w:tcBorders/>
             <w:shd w:fill="auto" w:val="clear"/>
           </w:tcPr>
@@ -15463,7 +15501,7 @@
         <w:trPr/>
         <w:tc>
           <w:tcPr>
-            <w:tcW w:w="2155" w:type="dxa"/>
+            <w:tcW w:w="2154" w:type="dxa"/>
             <w:tcBorders/>
             <w:shd w:fill="auto" w:val="clear"/>
           </w:tcPr>
@@ -15486,7 +15524,7 @@
         </w:tc>
         <w:tc>
           <w:tcPr>
-            <w:tcW w:w="6799" w:type="dxa"/>
+            <w:tcW w:w="6800" w:type="dxa"/>
             <w:tcBorders/>
             <w:shd w:fill="auto" w:val="clear"/>
           </w:tcPr>
@@ -15510,7 +15548,7 @@
         <w:trPr/>
         <w:tc>
           <w:tcPr>
-            <w:tcW w:w="2155" w:type="dxa"/>
+            <w:tcW w:w="2154" w:type="dxa"/>
             <w:tcBorders/>
             <w:shd w:fill="auto" w:val="clear"/>
           </w:tcPr>
@@ -15533,7 +15571,7 @@
         </w:tc>
         <w:tc>
           <w:tcPr>
-            <w:tcW w:w="6799" w:type="dxa"/>
+            <w:tcW w:w="6800" w:type="dxa"/>
             <w:tcBorders/>
             <w:shd w:fill="auto" w:val="clear"/>
           </w:tcPr>
@@ -15555,7 +15593,7 @@
         <w:trPr/>
         <w:tc>
           <w:tcPr>
-            <w:tcW w:w="2155" w:type="dxa"/>
+            <w:tcW w:w="2154" w:type="dxa"/>
             <w:tcBorders/>
             <w:shd w:fill="auto" w:val="clear"/>
           </w:tcPr>
@@ -15576,7 +15614,7 @@
         </w:tc>
         <w:tc>
           <w:tcPr>
-            <w:tcW w:w="6799" w:type="dxa"/>
+            <w:tcW w:w="6800" w:type="dxa"/>
             <w:tcBorders/>
             <w:shd w:fill="auto" w:val="clear"/>
           </w:tcPr>
@@ -15602,7 +15640,7 @@
         <w:trPr/>
         <w:tc>
           <w:tcPr>
-            <w:tcW w:w="2155" w:type="dxa"/>
+            <w:tcW w:w="2154" w:type="dxa"/>
             <w:tcBorders/>
             <w:shd w:fill="auto" w:val="clear"/>
           </w:tcPr>
@@ -15623,7 +15661,7 @@
         </w:tc>
         <w:tc>
           <w:tcPr>
-            <w:tcW w:w="6799" w:type="dxa"/>
+            <w:tcW w:w="6800" w:type="dxa"/>
             <w:tcBorders/>
             <w:shd w:fill="auto" w:val="clear"/>
           </w:tcPr>
@@ -15665,7 +15703,7 @@
         <w:trPr/>
         <w:tc>
           <w:tcPr>
-            <w:tcW w:w="2155" w:type="dxa"/>
+            <w:tcW w:w="2154" w:type="dxa"/>
             <w:tcBorders/>
             <w:shd w:fill="auto" w:val="clear"/>
           </w:tcPr>
@@ -15688,7 +15726,7 @@
         </w:tc>
         <w:tc>
           <w:tcPr>
-            <w:tcW w:w="6799" w:type="dxa"/>
+            <w:tcW w:w="6800" w:type="dxa"/>
             <w:tcBorders/>
             <w:shd w:fill="auto" w:val="clear"/>
           </w:tcPr>
@@ -15712,7 +15750,7 @@
         <w:trPr/>
         <w:tc>
           <w:tcPr>
-            <w:tcW w:w="2155" w:type="dxa"/>
+            <w:tcW w:w="2154" w:type="dxa"/>
             <w:tcBorders/>
             <w:shd w:fill="auto" w:val="clear"/>
           </w:tcPr>
@@ -15735,7 +15773,7 @@
         </w:tc>
         <w:tc>
           <w:tcPr>
-            <w:tcW w:w="6799" w:type="dxa"/>
+            <w:tcW w:w="6800" w:type="dxa"/>
             <w:tcBorders/>
             <w:shd w:fill="auto" w:val="clear"/>
           </w:tcPr>
@@ -15757,7 +15795,7 @@
         <w:trPr/>
         <w:tc>
           <w:tcPr>
-            <w:tcW w:w="2155" w:type="dxa"/>
+            <w:tcW w:w="2154" w:type="dxa"/>
             <w:tcBorders/>
             <w:shd w:fill="auto" w:val="clear"/>
           </w:tcPr>
@@ -15780,7 +15818,7 @@
         </w:tc>
         <w:tc>
           <w:tcPr>
-            <w:tcW w:w="6799" w:type="dxa"/>
+            <w:tcW w:w="6800" w:type="dxa"/>
             <w:tcBorders/>
             <w:shd w:fill="auto" w:val="clear"/>
           </w:tcPr>
@@ -16238,7 +16276,7 @@
       <w:rPr>
         <w:rStyle w:val="Sidetal"/>
       </w:rPr>
-      <w:t>12</w:t>
+      <w:t>17</w:t>
     </w:r>
     <w:r>
       <w:rPr>

</xml_diff>

<commit_message>
Minor change in text
</commit_message>
<xml_diff>
--- a/Documentation/Official Documentation/User's manual for IBOS MusicXmlReader version 4.0.0.0.docx
+++ b/Documentation/Official Documentation/User's manual for IBOS MusicXmlReader version 4.0.0.0.docx
@@ -1332,14 +1332,14 @@
         </w:tblCellMar>
       </w:tblPr>
       <w:tblGrid>
-        <w:gridCol w:w="1684"/>
-        <w:gridCol w:w="7491"/>
+        <w:gridCol w:w="1683"/>
+        <w:gridCol w:w="7492"/>
       </w:tblGrid>
       <w:tr>
         <w:trPr/>
         <w:tc>
           <w:tcPr>
-            <w:tcW w:w="1684" w:type="dxa"/>
+            <w:tcW w:w="1683" w:type="dxa"/>
             <w:tcBorders>
               <w:top w:val="single" w:sz="4" w:space="0" w:color="000000"/>
               <w:left w:val="single" w:sz="4" w:space="0" w:color="000000"/>
@@ -1367,7 +1367,7 @@
         </w:tc>
         <w:tc>
           <w:tcPr>
-            <w:tcW w:w="7491" w:type="dxa"/>
+            <w:tcW w:w="7492" w:type="dxa"/>
             <w:tcBorders>
               <w:top w:val="single" w:sz="4" w:space="0" w:color="000000"/>
               <w:left w:val="single" w:sz="4" w:space="0" w:color="000000"/>
@@ -1409,7 +1409,7 @@
         <w:trPr/>
         <w:tc>
           <w:tcPr>
-            <w:tcW w:w="1684" w:type="dxa"/>
+            <w:tcW w:w="1683" w:type="dxa"/>
             <w:tcBorders>
               <w:top w:val="single" w:sz="4" w:space="0" w:color="000000"/>
               <w:left w:val="single" w:sz="4" w:space="0" w:color="000000"/>
@@ -1439,7 +1439,7 @@
         </w:tc>
         <w:tc>
           <w:tcPr>
-            <w:tcW w:w="7491" w:type="dxa"/>
+            <w:tcW w:w="7492" w:type="dxa"/>
             <w:tcBorders>
               <w:top w:val="single" w:sz="4" w:space="0" w:color="000000"/>
               <w:left w:val="single" w:sz="4" w:space="0" w:color="000000"/>
@@ -1507,7 +1507,7 @@
         <w:trPr/>
         <w:tc>
           <w:tcPr>
-            <w:tcW w:w="1684" w:type="dxa"/>
+            <w:tcW w:w="1683" w:type="dxa"/>
             <w:tcBorders>
               <w:top w:val="single" w:sz="4" w:space="0" w:color="000000"/>
               <w:left w:val="single" w:sz="4" w:space="0" w:color="000000"/>
@@ -1535,7 +1535,7 @@
         </w:tc>
         <w:tc>
           <w:tcPr>
-            <w:tcW w:w="7491" w:type="dxa"/>
+            <w:tcW w:w="7492" w:type="dxa"/>
             <w:tcBorders>
               <w:top w:val="single" w:sz="4" w:space="0" w:color="000000"/>
               <w:left w:val="single" w:sz="4" w:space="0" w:color="000000"/>
@@ -1565,7 +1565,7 @@
         <w:trPr/>
         <w:tc>
           <w:tcPr>
-            <w:tcW w:w="1684" w:type="dxa"/>
+            <w:tcW w:w="1683" w:type="dxa"/>
             <w:tcBorders>
               <w:top w:val="single" w:sz="4" w:space="0" w:color="000000"/>
               <w:left w:val="single" w:sz="4" w:space="0" w:color="000000"/>
@@ -1593,7 +1593,7 @@
         </w:tc>
         <w:tc>
           <w:tcPr>
-            <w:tcW w:w="7491" w:type="dxa"/>
+            <w:tcW w:w="7492" w:type="dxa"/>
             <w:tcBorders>
               <w:top w:val="single" w:sz="4" w:space="0" w:color="000000"/>
               <w:left w:val="single" w:sz="4" w:space="0" w:color="000000"/>
@@ -1639,7 +1639,7 @@
         <w:trPr/>
         <w:tc>
           <w:tcPr>
-            <w:tcW w:w="1684" w:type="dxa"/>
+            <w:tcW w:w="1683" w:type="dxa"/>
             <w:tcBorders>
               <w:top w:val="single" w:sz="4" w:space="0" w:color="000000"/>
               <w:left w:val="single" w:sz="4" w:space="0" w:color="000000"/>
@@ -1672,7 +1672,7 @@
         </w:tc>
         <w:tc>
           <w:tcPr>
-            <w:tcW w:w="7491" w:type="dxa"/>
+            <w:tcW w:w="7492" w:type="dxa"/>
             <w:tcBorders>
               <w:top w:val="single" w:sz="4" w:space="0" w:color="000000"/>
               <w:left w:val="single" w:sz="4" w:space="0" w:color="000000"/>
@@ -2218,9 +2218,9 @@
         </w:tblCellMar>
       </w:tblPr>
       <w:tblGrid>
-        <w:gridCol w:w="1584"/>
+        <w:gridCol w:w="1583"/>
         <w:gridCol w:w="5220"/>
-        <w:gridCol w:w="2211"/>
+        <w:gridCol w:w="2212"/>
       </w:tblGrid>
       <w:tr>
         <w:trPr>
@@ -2228,7 +2228,7 @@
         </w:trPr>
         <w:tc>
           <w:tcPr>
-            <w:tcW w:w="1584" w:type="dxa"/>
+            <w:tcW w:w="1583" w:type="dxa"/>
             <w:tcBorders>
               <w:top w:val="single" w:sz="2" w:space="0" w:color="000000"/>
               <w:left w:val="single" w:sz="2" w:space="0" w:color="000000"/>
@@ -2298,7 +2298,7 @@
         </w:tc>
         <w:tc>
           <w:tcPr>
-            <w:tcW w:w="2211" w:type="dxa"/>
+            <w:tcW w:w="2212" w:type="dxa"/>
             <w:tcBorders>
               <w:top w:val="single" w:sz="2" w:space="0" w:color="000000"/>
               <w:left w:val="single" w:sz="2" w:space="0" w:color="000000"/>
@@ -2329,7 +2329,7 @@
         <w:trPr/>
         <w:tc>
           <w:tcPr>
-            <w:tcW w:w="1584" w:type="dxa"/>
+            <w:tcW w:w="1583" w:type="dxa"/>
             <w:tcBorders>
               <w:left w:val="single" w:sz="2" w:space="0" w:color="000000"/>
               <w:bottom w:val="single" w:sz="2" w:space="0" w:color="000000"/>
@@ -2393,7 +2393,7 @@
         </w:tc>
         <w:tc>
           <w:tcPr>
-            <w:tcW w:w="2211" w:type="dxa"/>
+            <w:tcW w:w="2212" w:type="dxa"/>
             <w:tcBorders>
               <w:left w:val="single" w:sz="2" w:space="0" w:color="000000"/>
               <w:bottom w:val="single" w:sz="2" w:space="0" w:color="000000"/>
@@ -2420,7 +2420,7 @@
         <w:trPr/>
         <w:tc>
           <w:tcPr>
-            <w:tcW w:w="1584" w:type="dxa"/>
+            <w:tcW w:w="1583" w:type="dxa"/>
             <w:tcBorders>
               <w:left w:val="single" w:sz="2" w:space="0" w:color="000000"/>
               <w:bottom w:val="single" w:sz="2" w:space="0" w:color="000000"/>
@@ -2481,7 +2481,7 @@
         </w:tc>
         <w:tc>
           <w:tcPr>
-            <w:tcW w:w="2211" w:type="dxa"/>
+            <w:tcW w:w="2212" w:type="dxa"/>
             <w:tcBorders>
               <w:left w:val="single" w:sz="2" w:space="0" w:color="000000"/>
               <w:bottom w:val="single" w:sz="2" w:space="0" w:color="000000"/>
@@ -2508,7 +2508,7 @@
         <w:trPr/>
         <w:tc>
           <w:tcPr>
-            <w:tcW w:w="1584" w:type="dxa"/>
+            <w:tcW w:w="1583" w:type="dxa"/>
             <w:tcBorders>
               <w:left w:val="single" w:sz="2" w:space="0" w:color="000000"/>
               <w:bottom w:val="single" w:sz="2" w:space="0" w:color="000000"/>
@@ -2555,7 +2555,7 @@
         </w:tc>
         <w:tc>
           <w:tcPr>
-            <w:tcW w:w="2211" w:type="dxa"/>
+            <w:tcW w:w="2212" w:type="dxa"/>
             <w:tcBorders>
               <w:left w:val="single" w:sz="2" w:space="0" w:color="000000"/>
               <w:bottom w:val="single" w:sz="2" w:space="0" w:color="000000"/>
@@ -2600,7 +2600,7 @@
         <w:trPr/>
         <w:tc>
           <w:tcPr>
-            <w:tcW w:w="1584" w:type="dxa"/>
+            <w:tcW w:w="1583" w:type="dxa"/>
             <w:tcBorders>
               <w:left w:val="single" w:sz="2" w:space="0" w:color="000000"/>
               <w:bottom w:val="single" w:sz="2" w:space="0" w:color="000000"/>
@@ -2649,7 +2649,7 @@
         </w:tc>
         <w:tc>
           <w:tcPr>
-            <w:tcW w:w="2211" w:type="dxa"/>
+            <w:tcW w:w="2212" w:type="dxa"/>
             <w:tcBorders>
               <w:left w:val="single" w:sz="2" w:space="0" w:color="000000"/>
               <w:bottom w:val="single" w:sz="2" w:space="0" w:color="000000"/>
@@ -2679,7 +2679,7 @@
         <w:trPr/>
         <w:tc>
           <w:tcPr>
-            <w:tcW w:w="1584" w:type="dxa"/>
+            <w:tcW w:w="1583" w:type="dxa"/>
             <w:tcBorders>
               <w:left w:val="single" w:sz="2" w:space="0" w:color="000000"/>
               <w:bottom w:val="single" w:sz="2" w:space="0" w:color="000000"/>
@@ -2728,7 +2728,7 @@
         </w:tc>
         <w:tc>
           <w:tcPr>
-            <w:tcW w:w="2211" w:type="dxa"/>
+            <w:tcW w:w="2212" w:type="dxa"/>
             <w:tcBorders>
               <w:left w:val="single" w:sz="2" w:space="0" w:color="000000"/>
               <w:bottom w:val="single" w:sz="2" w:space="0" w:color="000000"/>
@@ -2758,7 +2758,7 @@
         <w:trPr/>
         <w:tc>
           <w:tcPr>
-            <w:tcW w:w="1584" w:type="dxa"/>
+            <w:tcW w:w="1583" w:type="dxa"/>
             <w:tcBorders>
               <w:left w:val="single" w:sz="2" w:space="0" w:color="000000"/>
               <w:bottom w:val="single" w:sz="2" w:space="0" w:color="000000"/>
@@ -2807,7 +2807,7 @@
         </w:tc>
         <w:tc>
           <w:tcPr>
-            <w:tcW w:w="2211" w:type="dxa"/>
+            <w:tcW w:w="2212" w:type="dxa"/>
             <w:tcBorders>
               <w:left w:val="single" w:sz="2" w:space="0" w:color="000000"/>
               <w:bottom w:val="single" w:sz="2" w:space="0" w:color="000000"/>
@@ -2837,7 +2837,7 @@
         <w:trPr/>
         <w:tc>
           <w:tcPr>
-            <w:tcW w:w="1584" w:type="dxa"/>
+            <w:tcW w:w="1583" w:type="dxa"/>
             <w:tcBorders>
               <w:left w:val="single" w:sz="2" w:space="0" w:color="000000"/>
               <w:bottom w:val="single" w:sz="2" w:space="0" w:color="000000"/>
@@ -2883,7 +2883,7 @@
         </w:tc>
         <w:tc>
           <w:tcPr>
-            <w:tcW w:w="2211" w:type="dxa"/>
+            <w:tcW w:w="2212" w:type="dxa"/>
             <w:tcBorders>
               <w:left w:val="single" w:sz="2" w:space="0" w:color="000000"/>
               <w:bottom w:val="single" w:sz="2" w:space="0" w:color="000000"/>
@@ -2913,7 +2913,7 @@
         <w:trPr/>
         <w:tc>
           <w:tcPr>
-            <w:tcW w:w="1584" w:type="dxa"/>
+            <w:tcW w:w="1583" w:type="dxa"/>
             <w:tcBorders>
               <w:left w:val="single" w:sz="2" w:space="0" w:color="000000"/>
               <w:bottom w:val="single" w:sz="2" w:space="0" w:color="000000"/>
@@ -2973,7 +2973,7 @@
         </w:tc>
         <w:tc>
           <w:tcPr>
-            <w:tcW w:w="2211" w:type="dxa"/>
+            <w:tcW w:w="2212" w:type="dxa"/>
             <w:tcBorders>
               <w:left w:val="single" w:sz="2" w:space="0" w:color="000000"/>
               <w:bottom w:val="single" w:sz="2" w:space="0" w:color="000000"/>
@@ -3007,7 +3007,7 @@
         <w:trPr/>
         <w:tc>
           <w:tcPr>
-            <w:tcW w:w="1584" w:type="dxa"/>
+            <w:tcW w:w="1583" w:type="dxa"/>
             <w:tcBorders>
               <w:left w:val="single" w:sz="2" w:space="0" w:color="000000"/>
               <w:bottom w:val="single" w:sz="2" w:space="0" w:color="000000"/>
@@ -3067,7 +3067,7 @@
         </w:tc>
         <w:tc>
           <w:tcPr>
-            <w:tcW w:w="2211" w:type="dxa"/>
+            <w:tcW w:w="2212" w:type="dxa"/>
             <w:tcBorders>
               <w:left w:val="single" w:sz="2" w:space="0" w:color="000000"/>
               <w:bottom w:val="single" w:sz="2" w:space="0" w:color="000000"/>
@@ -3101,7 +3101,7 @@
         <w:trPr/>
         <w:tc>
           <w:tcPr>
-            <w:tcW w:w="1584" w:type="dxa"/>
+            <w:tcW w:w="1583" w:type="dxa"/>
             <w:tcBorders>
               <w:left w:val="single" w:sz="2" w:space="0" w:color="000000"/>
               <w:bottom w:val="single" w:sz="2" w:space="0" w:color="000000"/>
@@ -3161,7 +3161,7 @@
         </w:tc>
         <w:tc>
           <w:tcPr>
-            <w:tcW w:w="2211" w:type="dxa"/>
+            <w:tcW w:w="2212" w:type="dxa"/>
             <w:tcBorders>
               <w:left w:val="single" w:sz="2" w:space="0" w:color="000000"/>
               <w:bottom w:val="single" w:sz="2" w:space="0" w:color="000000"/>
@@ -3194,7 +3194,7 @@
         <w:trPr/>
         <w:tc>
           <w:tcPr>
-            <w:tcW w:w="1584" w:type="dxa"/>
+            <w:tcW w:w="1583" w:type="dxa"/>
             <w:tcBorders>
               <w:left w:val="single" w:sz="2" w:space="0" w:color="000000"/>
               <w:bottom w:val="single" w:sz="2" w:space="0" w:color="000000"/>
@@ -3243,7 +3243,7 @@
         </w:tc>
         <w:tc>
           <w:tcPr>
-            <w:tcW w:w="2211" w:type="dxa"/>
+            <w:tcW w:w="2212" w:type="dxa"/>
             <w:tcBorders>
               <w:left w:val="single" w:sz="2" w:space="0" w:color="000000"/>
               <w:bottom w:val="single" w:sz="2" w:space="0" w:color="000000"/>
@@ -3273,7 +3273,7 @@
         <w:trPr/>
         <w:tc>
           <w:tcPr>
-            <w:tcW w:w="1584" w:type="dxa"/>
+            <w:tcW w:w="1583" w:type="dxa"/>
             <w:tcBorders>
               <w:left w:val="single" w:sz="2" w:space="0" w:color="000000"/>
               <w:bottom w:val="single" w:sz="2" w:space="0" w:color="000000"/>
@@ -3327,7 +3327,7 @@
         </w:tc>
         <w:tc>
           <w:tcPr>
-            <w:tcW w:w="2211" w:type="dxa"/>
+            <w:tcW w:w="2212" w:type="dxa"/>
             <w:tcBorders>
               <w:left w:val="single" w:sz="2" w:space="0" w:color="000000"/>
               <w:bottom w:val="single" w:sz="2" w:space="0" w:color="000000"/>
@@ -3359,7 +3359,7 @@
         <w:trPr/>
         <w:tc>
           <w:tcPr>
-            <w:tcW w:w="1584" w:type="dxa"/>
+            <w:tcW w:w="1583" w:type="dxa"/>
             <w:tcBorders>
               <w:left w:val="single" w:sz="2" w:space="0" w:color="000000"/>
               <w:bottom w:val="single" w:sz="2" w:space="0" w:color="000000"/>
@@ -3411,7 +3411,7 @@
         </w:tc>
         <w:tc>
           <w:tcPr>
-            <w:tcW w:w="2211" w:type="dxa"/>
+            <w:tcW w:w="2212" w:type="dxa"/>
             <w:tcBorders>
               <w:left w:val="single" w:sz="2" w:space="0" w:color="000000"/>
               <w:bottom w:val="single" w:sz="2" w:space="0" w:color="000000"/>
@@ -3441,7 +3441,7 @@
         <w:trPr/>
         <w:tc>
           <w:tcPr>
-            <w:tcW w:w="1584" w:type="dxa"/>
+            <w:tcW w:w="1583" w:type="dxa"/>
             <w:tcBorders>
               <w:left w:val="single" w:sz="2" w:space="0" w:color="000000"/>
               <w:bottom w:val="single" w:sz="2" w:space="0" w:color="000000"/>
@@ -3495,7 +3495,7 @@
         </w:tc>
         <w:tc>
           <w:tcPr>
-            <w:tcW w:w="2211" w:type="dxa"/>
+            <w:tcW w:w="2212" w:type="dxa"/>
             <w:tcBorders>
               <w:left w:val="single" w:sz="2" w:space="0" w:color="000000"/>
               <w:bottom w:val="single" w:sz="2" w:space="0" w:color="000000"/>
@@ -3525,7 +3525,7 @@
         <w:trPr/>
         <w:tc>
           <w:tcPr>
-            <w:tcW w:w="1584" w:type="dxa"/>
+            <w:tcW w:w="1583" w:type="dxa"/>
             <w:tcBorders>
               <w:left w:val="single" w:sz="2" w:space="0" w:color="000000"/>
               <w:bottom w:val="single" w:sz="2" w:space="0" w:color="000000"/>
@@ -3579,7 +3579,7 @@
         </w:tc>
         <w:tc>
           <w:tcPr>
-            <w:tcW w:w="2211" w:type="dxa"/>
+            <w:tcW w:w="2212" w:type="dxa"/>
             <w:tcBorders>
               <w:left w:val="single" w:sz="2" w:space="0" w:color="000000"/>
               <w:bottom w:val="single" w:sz="2" w:space="0" w:color="000000"/>
@@ -3609,7 +3609,7 @@
         <w:trPr/>
         <w:tc>
           <w:tcPr>
-            <w:tcW w:w="1584" w:type="dxa"/>
+            <w:tcW w:w="1583" w:type="dxa"/>
             <w:tcBorders>
               <w:left w:val="single" w:sz="2" w:space="0" w:color="000000"/>
               <w:bottom w:val="single" w:sz="2" w:space="0" w:color="000000"/>
@@ -3663,7 +3663,7 @@
         </w:tc>
         <w:tc>
           <w:tcPr>
-            <w:tcW w:w="2211" w:type="dxa"/>
+            <w:tcW w:w="2212" w:type="dxa"/>
             <w:tcBorders>
               <w:left w:val="single" w:sz="2" w:space="0" w:color="000000"/>
               <w:bottom w:val="single" w:sz="2" w:space="0" w:color="000000"/>
@@ -3693,7 +3693,7 @@
         <w:trPr/>
         <w:tc>
           <w:tcPr>
-            <w:tcW w:w="1584" w:type="dxa"/>
+            <w:tcW w:w="1583" w:type="dxa"/>
             <w:tcBorders>
               <w:left w:val="single" w:sz="2" w:space="0" w:color="000000"/>
               <w:bottom w:val="single" w:sz="2" w:space="0" w:color="000000"/>
@@ -3745,7 +3745,7 @@
         </w:tc>
         <w:tc>
           <w:tcPr>
-            <w:tcW w:w="2211" w:type="dxa"/>
+            <w:tcW w:w="2212" w:type="dxa"/>
             <w:tcBorders>
               <w:left w:val="single" w:sz="2" w:space="0" w:color="000000"/>
               <w:bottom w:val="single" w:sz="2" w:space="0" w:color="000000"/>
@@ -3775,7 +3775,7 @@
         <w:trPr/>
         <w:tc>
           <w:tcPr>
-            <w:tcW w:w="1584" w:type="dxa"/>
+            <w:tcW w:w="1583" w:type="dxa"/>
             <w:tcBorders>
               <w:left w:val="single" w:sz="2" w:space="0" w:color="000000"/>
               <w:bottom w:val="single" w:sz="2" w:space="0" w:color="000000"/>
@@ -3827,7 +3827,7 @@
         </w:tc>
         <w:tc>
           <w:tcPr>
-            <w:tcW w:w="2211" w:type="dxa"/>
+            <w:tcW w:w="2212" w:type="dxa"/>
             <w:tcBorders>
               <w:left w:val="single" w:sz="2" w:space="0" w:color="000000"/>
               <w:bottom w:val="single" w:sz="2" w:space="0" w:color="000000"/>
@@ -3857,7 +3857,7 @@
         <w:trPr/>
         <w:tc>
           <w:tcPr>
-            <w:tcW w:w="1584" w:type="dxa"/>
+            <w:tcW w:w="1583" w:type="dxa"/>
             <w:tcBorders>
               <w:left w:val="single" w:sz="2" w:space="0" w:color="000000"/>
               <w:bottom w:val="single" w:sz="2" w:space="0" w:color="000000"/>
@@ -3910,7 +3910,7 @@
         </w:tc>
         <w:tc>
           <w:tcPr>
-            <w:tcW w:w="2211" w:type="dxa"/>
+            <w:tcW w:w="2212" w:type="dxa"/>
             <w:tcBorders>
               <w:left w:val="single" w:sz="2" w:space="0" w:color="000000"/>
               <w:bottom w:val="single" w:sz="2" w:space="0" w:color="000000"/>
@@ -3940,7 +3940,7 @@
         <w:trPr/>
         <w:tc>
           <w:tcPr>
-            <w:tcW w:w="1584" w:type="dxa"/>
+            <w:tcW w:w="1583" w:type="dxa"/>
             <w:tcBorders>
               <w:left w:val="single" w:sz="2" w:space="0" w:color="000000"/>
               <w:bottom w:val="single" w:sz="2" w:space="0" w:color="000000"/>
@@ -3993,7 +3993,7 @@
         </w:tc>
         <w:tc>
           <w:tcPr>
-            <w:tcW w:w="2211" w:type="dxa"/>
+            <w:tcW w:w="2212" w:type="dxa"/>
             <w:tcBorders>
               <w:left w:val="single" w:sz="2" w:space="0" w:color="000000"/>
               <w:bottom w:val="single" w:sz="2" w:space="0" w:color="000000"/>
@@ -4023,7 +4023,7 @@
         <w:trPr/>
         <w:tc>
           <w:tcPr>
-            <w:tcW w:w="1584" w:type="dxa"/>
+            <w:tcW w:w="1583" w:type="dxa"/>
             <w:tcBorders>
               <w:left w:val="single" w:sz="2" w:space="0" w:color="000000"/>
               <w:bottom w:val="single" w:sz="2" w:space="0" w:color="000000"/>
@@ -4076,7 +4076,7 @@
         </w:tc>
         <w:tc>
           <w:tcPr>
-            <w:tcW w:w="2211" w:type="dxa"/>
+            <w:tcW w:w="2212" w:type="dxa"/>
             <w:tcBorders>
               <w:left w:val="single" w:sz="2" w:space="0" w:color="000000"/>
               <w:bottom w:val="single" w:sz="2" w:space="0" w:color="000000"/>
@@ -4106,7 +4106,7 @@
         <w:trPr/>
         <w:tc>
           <w:tcPr>
-            <w:tcW w:w="1584" w:type="dxa"/>
+            <w:tcW w:w="1583" w:type="dxa"/>
             <w:tcBorders>
               <w:left w:val="single" w:sz="2" w:space="0" w:color="000000"/>
               <w:bottom w:val="single" w:sz="2" w:space="0" w:color="000000"/>
@@ -4158,7 +4158,7 @@
         </w:tc>
         <w:tc>
           <w:tcPr>
-            <w:tcW w:w="2211" w:type="dxa"/>
+            <w:tcW w:w="2212" w:type="dxa"/>
             <w:tcBorders>
               <w:left w:val="single" w:sz="2" w:space="0" w:color="000000"/>
               <w:bottom w:val="single" w:sz="2" w:space="0" w:color="000000"/>
@@ -4188,7 +4188,7 @@
         <w:trPr/>
         <w:tc>
           <w:tcPr>
-            <w:tcW w:w="1584" w:type="dxa"/>
+            <w:tcW w:w="1583" w:type="dxa"/>
             <w:tcBorders>
               <w:left w:val="single" w:sz="2" w:space="0" w:color="000000"/>
               <w:bottom w:val="single" w:sz="2" w:space="0" w:color="000000"/>
@@ -4243,7 +4243,7 @@
         </w:tc>
         <w:tc>
           <w:tcPr>
-            <w:tcW w:w="2211" w:type="dxa"/>
+            <w:tcW w:w="2212" w:type="dxa"/>
             <w:tcBorders>
               <w:left w:val="single" w:sz="2" w:space="0" w:color="000000"/>
               <w:bottom w:val="single" w:sz="2" w:space="0" w:color="000000"/>
@@ -4273,7 +4273,7 @@
         <w:trPr/>
         <w:tc>
           <w:tcPr>
-            <w:tcW w:w="1584" w:type="dxa"/>
+            <w:tcW w:w="1583" w:type="dxa"/>
             <w:tcBorders>
               <w:left w:val="single" w:sz="2" w:space="0" w:color="000000"/>
               <w:bottom w:val="single" w:sz="2" w:space="0" w:color="000000"/>
@@ -4329,7 +4329,7 @@
         </w:tc>
         <w:tc>
           <w:tcPr>
-            <w:tcW w:w="2211" w:type="dxa"/>
+            <w:tcW w:w="2212" w:type="dxa"/>
             <w:tcBorders>
               <w:left w:val="single" w:sz="2" w:space="0" w:color="000000"/>
               <w:bottom w:val="single" w:sz="2" w:space="0" w:color="000000"/>
@@ -4359,7 +4359,7 @@
         <w:trPr/>
         <w:tc>
           <w:tcPr>
-            <w:tcW w:w="1584" w:type="dxa"/>
+            <w:tcW w:w="1583" w:type="dxa"/>
             <w:tcBorders>
               <w:left w:val="single" w:sz="2" w:space="0" w:color="000000"/>
               <w:bottom w:val="single" w:sz="2" w:space="0" w:color="000000"/>
@@ -4415,7 +4415,7 @@
         </w:tc>
         <w:tc>
           <w:tcPr>
-            <w:tcW w:w="2211" w:type="dxa"/>
+            <w:tcW w:w="2212" w:type="dxa"/>
             <w:tcBorders>
               <w:left w:val="single" w:sz="2" w:space="0" w:color="000000"/>
               <w:bottom w:val="single" w:sz="2" w:space="0" w:color="000000"/>
@@ -4447,7 +4447,7 @@
         <w:trPr/>
         <w:tc>
           <w:tcPr>
-            <w:tcW w:w="1584" w:type="dxa"/>
+            <w:tcW w:w="1583" w:type="dxa"/>
             <w:tcBorders>
               <w:left w:val="single" w:sz="2" w:space="0" w:color="000000"/>
               <w:bottom w:val="single" w:sz="2" w:space="0" w:color="000000"/>
@@ -4499,7 +4499,7 @@
         </w:tc>
         <w:tc>
           <w:tcPr>
-            <w:tcW w:w="2211" w:type="dxa"/>
+            <w:tcW w:w="2212" w:type="dxa"/>
             <w:tcBorders>
               <w:left w:val="single" w:sz="2" w:space="0" w:color="000000"/>
               <w:bottom w:val="single" w:sz="2" w:space="0" w:color="000000"/>
@@ -4535,7 +4535,7 @@
         <w:trPr/>
         <w:tc>
           <w:tcPr>
-            <w:tcW w:w="1584" w:type="dxa"/>
+            <w:tcW w:w="1583" w:type="dxa"/>
             <w:tcBorders>
               <w:left w:val="single" w:sz="2" w:space="0" w:color="000000"/>
               <w:bottom w:val="single" w:sz="2" w:space="0" w:color="000000"/>
@@ -4587,7 +4587,7 @@
         </w:tc>
         <w:tc>
           <w:tcPr>
-            <w:tcW w:w="2211" w:type="dxa"/>
+            <w:tcW w:w="2212" w:type="dxa"/>
             <w:tcBorders>
               <w:left w:val="single" w:sz="2" w:space="0" w:color="000000"/>
               <w:bottom w:val="single" w:sz="2" w:space="0" w:color="000000"/>
@@ -4623,7 +4623,7 @@
         <w:trPr/>
         <w:tc>
           <w:tcPr>
-            <w:tcW w:w="1584" w:type="dxa"/>
+            <w:tcW w:w="1583" w:type="dxa"/>
             <w:tcBorders>
               <w:left w:val="single" w:sz="2" w:space="0" w:color="000000"/>
               <w:bottom w:val="single" w:sz="2" w:space="0" w:color="000000"/>
@@ -4683,7 +4683,7 @@
         </w:tc>
         <w:tc>
           <w:tcPr>
-            <w:tcW w:w="2211" w:type="dxa"/>
+            <w:tcW w:w="2212" w:type="dxa"/>
             <w:tcBorders>
               <w:left w:val="single" w:sz="2" w:space="0" w:color="000000"/>
               <w:bottom w:val="single" w:sz="2" w:space="0" w:color="000000"/>
@@ -4720,7 +4720,7 @@
         <w:trPr/>
         <w:tc>
           <w:tcPr>
-            <w:tcW w:w="1584" w:type="dxa"/>
+            <w:tcW w:w="1583" w:type="dxa"/>
             <w:tcBorders>
               <w:left w:val="single" w:sz="2" w:space="0" w:color="000000"/>
               <w:bottom w:val="single" w:sz="2" w:space="0" w:color="000000"/>
@@ -4780,7 +4780,7 @@
         </w:tc>
         <w:tc>
           <w:tcPr>
-            <w:tcW w:w="2211" w:type="dxa"/>
+            <w:tcW w:w="2212" w:type="dxa"/>
             <w:tcBorders>
               <w:left w:val="single" w:sz="2" w:space="0" w:color="000000"/>
               <w:bottom w:val="single" w:sz="2" w:space="0" w:color="000000"/>
@@ -4817,7 +4817,7 @@
         <w:trPr/>
         <w:tc>
           <w:tcPr>
-            <w:tcW w:w="1584" w:type="dxa"/>
+            <w:tcW w:w="1583" w:type="dxa"/>
             <w:tcBorders>
               <w:left w:val="single" w:sz="2" w:space="0" w:color="000000"/>
               <w:bottom w:val="single" w:sz="2" w:space="0" w:color="000000"/>
@@ -4877,7 +4877,7 @@
         </w:tc>
         <w:tc>
           <w:tcPr>
-            <w:tcW w:w="2211" w:type="dxa"/>
+            <w:tcW w:w="2212" w:type="dxa"/>
             <w:tcBorders>
               <w:left w:val="single" w:sz="2" w:space="0" w:color="000000"/>
               <w:bottom w:val="single" w:sz="2" w:space="0" w:color="000000"/>
@@ -4914,7 +4914,7 @@
         <w:trPr/>
         <w:tc>
           <w:tcPr>
-            <w:tcW w:w="1584" w:type="dxa"/>
+            <w:tcW w:w="1583" w:type="dxa"/>
             <w:tcBorders>
               <w:left w:val="single" w:sz="2" w:space="0" w:color="000000"/>
               <w:bottom w:val="single" w:sz="2" w:space="0" w:color="000000"/>
@@ -4968,7 +4968,7 @@
         </w:tc>
         <w:tc>
           <w:tcPr>
-            <w:tcW w:w="2211" w:type="dxa"/>
+            <w:tcW w:w="2212" w:type="dxa"/>
             <w:tcBorders>
               <w:left w:val="single" w:sz="2" w:space="0" w:color="000000"/>
               <w:bottom w:val="single" w:sz="2" w:space="0" w:color="000000"/>
@@ -5002,7 +5002,7 @@
         <w:trPr/>
         <w:tc>
           <w:tcPr>
-            <w:tcW w:w="1584" w:type="dxa"/>
+            <w:tcW w:w="1583" w:type="dxa"/>
             <w:tcBorders>
               <w:left w:val="single" w:sz="2" w:space="0" w:color="000000"/>
               <w:bottom w:val="single" w:sz="2" w:space="0" w:color="000000"/>
@@ -5057,7 +5057,7 @@
         </w:tc>
         <w:tc>
           <w:tcPr>
-            <w:tcW w:w="2211" w:type="dxa"/>
+            <w:tcW w:w="2212" w:type="dxa"/>
             <w:tcBorders>
               <w:left w:val="single" w:sz="2" w:space="0" w:color="000000"/>
               <w:bottom w:val="single" w:sz="2" w:space="0" w:color="000000"/>
@@ -5091,7 +5091,7 @@
         <w:trPr/>
         <w:tc>
           <w:tcPr>
-            <w:tcW w:w="1584" w:type="dxa"/>
+            <w:tcW w:w="1583" w:type="dxa"/>
             <w:tcBorders>
               <w:left w:val="single" w:sz="2" w:space="0" w:color="000000"/>
               <w:bottom w:val="single" w:sz="2" w:space="0" w:color="000000"/>
@@ -5135,7 +5135,7 @@
         </w:tc>
         <w:tc>
           <w:tcPr>
-            <w:tcW w:w="2211" w:type="dxa"/>
+            <w:tcW w:w="2212" w:type="dxa"/>
             <w:tcBorders>
               <w:left w:val="single" w:sz="2" w:space="0" w:color="000000"/>
               <w:bottom w:val="single" w:sz="2" w:space="0" w:color="000000"/>
@@ -5169,7 +5169,7 @@
         <w:trPr/>
         <w:tc>
           <w:tcPr>
-            <w:tcW w:w="1584" w:type="dxa"/>
+            <w:tcW w:w="1583" w:type="dxa"/>
             <w:tcBorders>
               <w:left w:val="single" w:sz="2" w:space="0" w:color="000000"/>
               <w:bottom w:val="single" w:sz="2" w:space="0" w:color="000000"/>
@@ -5213,7 +5213,7 @@
         </w:tc>
         <w:tc>
           <w:tcPr>
-            <w:tcW w:w="2211" w:type="dxa"/>
+            <w:tcW w:w="2212" w:type="dxa"/>
             <w:tcBorders>
               <w:left w:val="single" w:sz="2" w:space="0" w:color="000000"/>
               <w:bottom w:val="single" w:sz="2" w:space="0" w:color="000000"/>
@@ -5247,7 +5247,7 @@
         <w:trPr/>
         <w:tc>
           <w:tcPr>
-            <w:tcW w:w="1584" w:type="dxa"/>
+            <w:tcW w:w="1583" w:type="dxa"/>
             <w:tcBorders>
               <w:left w:val="single" w:sz="2" w:space="0" w:color="000000"/>
               <w:bottom w:val="single" w:sz="2" w:space="0" w:color="000000"/>
@@ -5296,7 +5296,7 @@
         </w:tc>
         <w:tc>
           <w:tcPr>
-            <w:tcW w:w="2211" w:type="dxa"/>
+            <w:tcW w:w="2212" w:type="dxa"/>
             <w:tcBorders>
               <w:left w:val="single" w:sz="2" w:space="0" w:color="000000"/>
               <w:bottom w:val="single" w:sz="2" w:space="0" w:color="000000"/>
@@ -5326,7 +5326,7 @@
         <w:trPr/>
         <w:tc>
           <w:tcPr>
-            <w:tcW w:w="1584" w:type="dxa"/>
+            <w:tcW w:w="1583" w:type="dxa"/>
             <w:tcBorders>
               <w:left w:val="single" w:sz="2" w:space="0" w:color="000000"/>
               <w:bottom w:val="single" w:sz="2" w:space="0" w:color="000000"/>
@@ -5376,7 +5376,7 @@
         </w:tc>
         <w:tc>
           <w:tcPr>
-            <w:tcW w:w="2211" w:type="dxa"/>
+            <w:tcW w:w="2212" w:type="dxa"/>
             <w:tcBorders>
               <w:left w:val="single" w:sz="2" w:space="0" w:color="000000"/>
               <w:bottom w:val="single" w:sz="2" w:space="0" w:color="000000"/>
@@ -5408,7 +5408,7 @@
         <w:trPr/>
         <w:tc>
           <w:tcPr>
-            <w:tcW w:w="1584" w:type="dxa"/>
+            <w:tcW w:w="1583" w:type="dxa"/>
             <w:tcBorders>
               <w:left w:val="single" w:sz="2" w:space="0" w:color="000000"/>
               <w:bottom w:val="single" w:sz="2" w:space="0" w:color="000000"/>
@@ -5464,7 +5464,7 @@
         </w:tc>
         <w:tc>
           <w:tcPr>
-            <w:tcW w:w="2211" w:type="dxa"/>
+            <w:tcW w:w="2212" w:type="dxa"/>
             <w:tcBorders>
               <w:left w:val="single" w:sz="2" w:space="0" w:color="000000"/>
               <w:bottom w:val="single" w:sz="2" w:space="0" w:color="000000"/>
@@ -5496,7 +5496,7 @@
         <w:trPr/>
         <w:tc>
           <w:tcPr>
-            <w:tcW w:w="1584" w:type="dxa"/>
+            <w:tcW w:w="1583" w:type="dxa"/>
             <w:tcBorders>
               <w:left w:val="single" w:sz="2" w:space="0" w:color="000000"/>
               <w:bottom w:val="single" w:sz="2" w:space="0" w:color="000000"/>
@@ -5546,7 +5546,7 @@
         </w:tc>
         <w:tc>
           <w:tcPr>
-            <w:tcW w:w="2211" w:type="dxa"/>
+            <w:tcW w:w="2212" w:type="dxa"/>
             <w:tcBorders>
               <w:left w:val="single" w:sz="2" w:space="0" w:color="000000"/>
               <w:bottom w:val="single" w:sz="2" w:space="0" w:color="000000"/>
@@ -5578,7 +5578,7 @@
         <w:trPr/>
         <w:tc>
           <w:tcPr>
-            <w:tcW w:w="1584" w:type="dxa"/>
+            <w:tcW w:w="1583" w:type="dxa"/>
             <w:tcBorders>
               <w:left w:val="single" w:sz="2" w:space="0" w:color="000000"/>
               <w:bottom w:val="single" w:sz="2" w:space="0" w:color="000000"/>
@@ -5628,7 +5628,7 @@
         </w:tc>
         <w:tc>
           <w:tcPr>
-            <w:tcW w:w="2211" w:type="dxa"/>
+            <w:tcW w:w="2212" w:type="dxa"/>
             <w:tcBorders>
               <w:left w:val="single" w:sz="2" w:space="0" w:color="000000"/>
               <w:bottom w:val="single" w:sz="2" w:space="0" w:color="000000"/>
@@ -5660,7 +5660,7 @@
         <w:trPr/>
         <w:tc>
           <w:tcPr>
-            <w:tcW w:w="1584" w:type="dxa"/>
+            <w:tcW w:w="1583" w:type="dxa"/>
             <w:tcBorders>
               <w:left w:val="single" w:sz="2" w:space="0" w:color="000000"/>
               <w:bottom w:val="single" w:sz="2" w:space="0" w:color="000000"/>
@@ -5710,7 +5710,7 @@
         </w:tc>
         <w:tc>
           <w:tcPr>
-            <w:tcW w:w="2211" w:type="dxa"/>
+            <w:tcW w:w="2212" w:type="dxa"/>
             <w:tcBorders>
               <w:left w:val="single" w:sz="2" w:space="0" w:color="000000"/>
               <w:bottom w:val="single" w:sz="2" w:space="0" w:color="000000"/>
@@ -5742,7 +5742,7 @@
         <w:trPr/>
         <w:tc>
           <w:tcPr>
-            <w:tcW w:w="1584" w:type="dxa"/>
+            <w:tcW w:w="1583" w:type="dxa"/>
             <w:tcBorders>
               <w:left w:val="single" w:sz="2" w:space="0" w:color="000000"/>
               <w:bottom w:val="single" w:sz="2" w:space="0" w:color="000000"/>
@@ -5796,7 +5796,7 @@
         </w:tc>
         <w:tc>
           <w:tcPr>
-            <w:tcW w:w="2211" w:type="dxa"/>
+            <w:tcW w:w="2212" w:type="dxa"/>
             <w:tcBorders>
               <w:left w:val="single" w:sz="2" w:space="0" w:color="000000"/>
               <w:bottom w:val="single" w:sz="2" w:space="0" w:color="000000"/>
@@ -5828,7 +5828,7 @@
         <w:trPr/>
         <w:tc>
           <w:tcPr>
-            <w:tcW w:w="1584" w:type="dxa"/>
+            <w:tcW w:w="1583" w:type="dxa"/>
             <w:tcBorders>
               <w:left w:val="single" w:sz="2" w:space="0" w:color="000000"/>
               <w:bottom w:val="single" w:sz="2" w:space="0" w:color="000000"/>
@@ -5969,7 +5969,7 @@
         </w:tc>
         <w:tc>
           <w:tcPr>
-            <w:tcW w:w="2211" w:type="dxa"/>
+            <w:tcW w:w="2212" w:type="dxa"/>
             <w:tcBorders>
               <w:left w:val="single" w:sz="2" w:space="0" w:color="000000"/>
               <w:bottom w:val="single" w:sz="2" w:space="0" w:color="000000"/>
@@ -6001,7 +6001,7 @@
         <w:trPr/>
         <w:tc>
           <w:tcPr>
-            <w:tcW w:w="1584" w:type="dxa"/>
+            <w:tcW w:w="1583" w:type="dxa"/>
             <w:tcBorders>
               <w:left w:val="single" w:sz="2" w:space="0" w:color="000000"/>
               <w:bottom w:val="single" w:sz="2" w:space="0" w:color="000000"/>
@@ -6101,7 +6101,7 @@
         </w:tc>
         <w:tc>
           <w:tcPr>
-            <w:tcW w:w="2211" w:type="dxa"/>
+            <w:tcW w:w="2212" w:type="dxa"/>
             <w:tcBorders>
               <w:left w:val="single" w:sz="2" w:space="0" w:color="000000"/>
               <w:bottom w:val="single" w:sz="2" w:space="0" w:color="000000"/>
@@ -7309,15 +7309,15 @@
         </w:tblCellMar>
       </w:tblPr>
       <w:tblGrid>
-        <w:gridCol w:w="3233"/>
+        <w:gridCol w:w="3232"/>
         <w:gridCol w:w="2309"/>
-        <w:gridCol w:w="3413"/>
+        <w:gridCol w:w="3414"/>
       </w:tblGrid>
       <w:tr>
         <w:trPr/>
         <w:tc>
           <w:tcPr>
-            <w:tcW w:w="3233" w:type="dxa"/>
+            <w:tcW w:w="3232" w:type="dxa"/>
             <w:tcBorders/>
             <w:shd w:fill="auto" w:val="clear"/>
           </w:tcPr>
@@ -7359,7 +7359,7 @@
         </w:tc>
         <w:tc>
           <w:tcPr>
-            <w:tcW w:w="3413" w:type="dxa"/>
+            <w:tcW w:w="3414" w:type="dxa"/>
             <w:tcBorders/>
             <w:shd w:fill="auto" w:val="clear"/>
           </w:tcPr>
@@ -7383,7 +7383,7 @@
         <w:trPr/>
         <w:tc>
           <w:tcPr>
-            <w:tcW w:w="3233" w:type="dxa"/>
+            <w:tcW w:w="3232" w:type="dxa"/>
             <w:tcBorders/>
             <w:shd w:fill="auto" w:val="clear"/>
           </w:tcPr>
@@ -7426,7 +7426,7 @@
         </w:tc>
         <w:tc>
           <w:tcPr>
-            <w:tcW w:w="3413" w:type="dxa"/>
+            <w:tcW w:w="3414" w:type="dxa"/>
             <w:tcBorders/>
             <w:shd w:fill="auto" w:val="clear"/>
           </w:tcPr>
@@ -7475,7 +7475,7 @@
         <w:trPr/>
         <w:tc>
           <w:tcPr>
-            <w:tcW w:w="3233" w:type="dxa"/>
+            <w:tcW w:w="3232" w:type="dxa"/>
             <w:tcBorders/>
             <w:shd w:fill="auto" w:val="clear"/>
           </w:tcPr>
@@ -7534,7 +7534,7 @@
         </w:tc>
         <w:tc>
           <w:tcPr>
-            <w:tcW w:w="3413" w:type="dxa"/>
+            <w:tcW w:w="3414" w:type="dxa"/>
             <w:tcBorders/>
             <w:shd w:fill="auto" w:val="clear"/>
           </w:tcPr>
@@ -7560,7 +7560,7 @@
         <w:trPr/>
         <w:tc>
           <w:tcPr>
-            <w:tcW w:w="3233" w:type="dxa"/>
+            <w:tcW w:w="3232" w:type="dxa"/>
             <w:tcBorders/>
             <w:shd w:fill="auto" w:val="clear"/>
           </w:tcPr>
@@ -7603,7 +7603,7 @@
         </w:tc>
         <w:tc>
           <w:tcPr>
-            <w:tcW w:w="3413" w:type="dxa"/>
+            <w:tcW w:w="3414" w:type="dxa"/>
             <w:tcBorders/>
             <w:shd w:fill="auto" w:val="clear"/>
           </w:tcPr>
@@ -7629,7 +7629,7 @@
         <w:trPr/>
         <w:tc>
           <w:tcPr>
-            <w:tcW w:w="3233" w:type="dxa"/>
+            <w:tcW w:w="3232" w:type="dxa"/>
             <w:tcBorders/>
             <w:shd w:fill="auto" w:val="clear"/>
           </w:tcPr>
@@ -7672,7 +7672,7 @@
         </w:tc>
         <w:tc>
           <w:tcPr>
-            <w:tcW w:w="3413" w:type="dxa"/>
+            <w:tcW w:w="3414" w:type="dxa"/>
             <w:tcBorders/>
             <w:shd w:fill="auto" w:val="clear"/>
           </w:tcPr>
@@ -7698,7 +7698,7 @@
         <w:trPr/>
         <w:tc>
           <w:tcPr>
-            <w:tcW w:w="3233" w:type="dxa"/>
+            <w:tcW w:w="3232" w:type="dxa"/>
             <w:tcBorders/>
             <w:shd w:fill="auto" w:val="clear"/>
           </w:tcPr>
@@ -7744,7 +7744,7 @@
         </w:tc>
         <w:tc>
           <w:tcPr>
-            <w:tcW w:w="3413" w:type="dxa"/>
+            <w:tcW w:w="3414" w:type="dxa"/>
             <w:tcBorders/>
             <w:shd w:fill="auto" w:val="clear"/>
           </w:tcPr>
@@ -7868,15 +7868,15 @@
         </w:tblCellMar>
       </w:tblPr>
       <w:tblGrid>
-        <w:gridCol w:w="3233"/>
+        <w:gridCol w:w="3232"/>
         <w:gridCol w:w="2339"/>
-        <w:gridCol w:w="3443"/>
+        <w:gridCol w:w="3444"/>
       </w:tblGrid>
       <w:tr>
         <w:trPr/>
         <w:tc>
           <w:tcPr>
-            <w:tcW w:w="3233" w:type="dxa"/>
+            <w:tcW w:w="3232" w:type="dxa"/>
             <w:tcBorders/>
             <w:shd w:fill="auto" w:val="clear"/>
           </w:tcPr>
@@ -7922,7 +7922,7 @@
         </w:tc>
         <w:tc>
           <w:tcPr>
-            <w:tcW w:w="3443" w:type="dxa"/>
+            <w:tcW w:w="3444" w:type="dxa"/>
             <w:tcBorders/>
             <w:shd w:fill="auto" w:val="clear"/>
           </w:tcPr>
@@ -7948,7 +7948,7 @@
         <w:trPr/>
         <w:tc>
           <w:tcPr>
-            <w:tcW w:w="3233" w:type="dxa"/>
+            <w:tcW w:w="3232" w:type="dxa"/>
             <w:tcBorders/>
             <w:shd w:fill="auto" w:val="clear"/>
           </w:tcPr>
@@ -7994,7 +7994,7 @@
         </w:tc>
         <w:tc>
           <w:tcPr>
-            <w:tcW w:w="3443" w:type="dxa"/>
+            <w:tcW w:w="3444" w:type="dxa"/>
             <w:tcBorders/>
             <w:shd w:fill="auto" w:val="clear"/>
           </w:tcPr>
@@ -8415,14 +8415,14 @@
         </w:tblCellMar>
       </w:tblPr>
       <w:tblGrid>
-        <w:gridCol w:w="1794"/>
-        <w:gridCol w:w="7160"/>
+        <w:gridCol w:w="1793"/>
+        <w:gridCol w:w="7161"/>
       </w:tblGrid>
       <w:tr>
         <w:trPr/>
         <w:tc>
           <w:tcPr>
-            <w:tcW w:w="1794" w:type="dxa"/>
+            <w:tcW w:w="1793" w:type="dxa"/>
             <w:tcBorders/>
             <w:shd w:fill="auto" w:val="clear"/>
           </w:tcPr>
@@ -8445,7 +8445,7 @@
         </w:tc>
         <w:tc>
           <w:tcPr>
-            <w:tcW w:w="7160" w:type="dxa"/>
+            <w:tcW w:w="7161" w:type="dxa"/>
             <w:tcBorders/>
             <w:shd w:fill="auto" w:val="clear"/>
           </w:tcPr>
@@ -8471,7 +8471,7 @@
         <w:trPr/>
         <w:tc>
           <w:tcPr>
-            <w:tcW w:w="1794" w:type="dxa"/>
+            <w:tcW w:w="1793" w:type="dxa"/>
             <w:tcBorders/>
             <w:shd w:fill="auto" w:val="clear"/>
           </w:tcPr>
@@ -8492,7 +8492,7 @@
         </w:tc>
         <w:tc>
           <w:tcPr>
-            <w:tcW w:w="7160" w:type="dxa"/>
+            <w:tcW w:w="7161" w:type="dxa"/>
             <w:tcBorders/>
             <w:shd w:fill="auto" w:val="clear"/>
           </w:tcPr>
@@ -8514,7 +8514,7 @@
         <w:trPr/>
         <w:tc>
           <w:tcPr>
-            <w:tcW w:w="1794" w:type="dxa"/>
+            <w:tcW w:w="1793" w:type="dxa"/>
             <w:tcBorders/>
             <w:shd w:fill="auto" w:val="clear"/>
           </w:tcPr>
@@ -8535,7 +8535,7 @@
         </w:tc>
         <w:tc>
           <w:tcPr>
-            <w:tcW w:w="7160" w:type="dxa"/>
+            <w:tcW w:w="7161" w:type="dxa"/>
             <w:tcBorders/>
             <w:shd w:fill="auto" w:val="clear"/>
           </w:tcPr>
@@ -8559,7 +8559,7 @@
         <w:trPr/>
         <w:tc>
           <w:tcPr>
-            <w:tcW w:w="1794" w:type="dxa"/>
+            <w:tcW w:w="1793" w:type="dxa"/>
             <w:tcBorders/>
             <w:shd w:fill="auto" w:val="clear"/>
           </w:tcPr>
@@ -8580,7 +8580,7 @@
         </w:tc>
         <w:tc>
           <w:tcPr>
-            <w:tcW w:w="7160" w:type="dxa"/>
+            <w:tcW w:w="7161" w:type="dxa"/>
             <w:tcBorders/>
             <w:shd w:fill="auto" w:val="clear"/>
           </w:tcPr>
@@ -8606,7 +8606,7 @@
         </w:trPr>
         <w:tc>
           <w:tcPr>
-            <w:tcW w:w="1794" w:type="dxa"/>
+            <w:tcW w:w="1793" w:type="dxa"/>
             <w:tcBorders/>
             <w:shd w:fill="auto" w:val="clear"/>
           </w:tcPr>
@@ -8627,7 +8627,7 @@
         </w:tc>
         <w:tc>
           <w:tcPr>
-            <w:tcW w:w="7160" w:type="dxa"/>
+            <w:tcW w:w="7161" w:type="dxa"/>
             <w:tcBorders/>
             <w:shd w:fill="auto" w:val="clear"/>
           </w:tcPr>
@@ -8651,7 +8651,7 @@
         <w:trPr/>
         <w:tc>
           <w:tcPr>
-            <w:tcW w:w="1794" w:type="dxa"/>
+            <w:tcW w:w="1793" w:type="dxa"/>
             <w:tcBorders/>
             <w:shd w:fill="auto" w:val="clear"/>
           </w:tcPr>
@@ -8672,7 +8672,7 @@
         </w:tc>
         <w:tc>
           <w:tcPr>
-            <w:tcW w:w="7160" w:type="dxa"/>
+            <w:tcW w:w="7161" w:type="dxa"/>
             <w:tcBorders/>
             <w:shd w:fill="auto" w:val="clear"/>
           </w:tcPr>
@@ -8694,7 +8694,7 @@
         <w:trPr/>
         <w:tc>
           <w:tcPr>
-            <w:tcW w:w="1794" w:type="dxa"/>
+            <w:tcW w:w="1793" w:type="dxa"/>
             <w:tcBorders/>
             <w:shd w:fill="auto" w:val="clear"/>
           </w:tcPr>
@@ -8715,7 +8715,7 @@
         </w:tc>
         <w:tc>
           <w:tcPr>
-            <w:tcW w:w="7160" w:type="dxa"/>
+            <w:tcW w:w="7161" w:type="dxa"/>
             <w:tcBorders/>
             <w:shd w:fill="auto" w:val="clear"/>
           </w:tcPr>
@@ -8753,7 +8753,7 @@
         <w:trPr/>
         <w:tc>
           <w:tcPr>
-            <w:tcW w:w="1794" w:type="dxa"/>
+            <w:tcW w:w="1793" w:type="dxa"/>
             <w:tcBorders/>
             <w:shd w:fill="auto" w:val="clear"/>
           </w:tcPr>
@@ -8774,7 +8774,7 @@
         </w:tc>
         <w:tc>
           <w:tcPr>
-            <w:tcW w:w="7160" w:type="dxa"/>
+            <w:tcW w:w="7161" w:type="dxa"/>
             <w:tcBorders/>
             <w:shd w:fill="auto" w:val="clear"/>
           </w:tcPr>
@@ -8873,14 +8873,14 @@
         </w:tblCellMar>
       </w:tblPr>
       <w:tblGrid>
-        <w:gridCol w:w="2203"/>
-        <w:gridCol w:w="7441"/>
+        <w:gridCol w:w="2202"/>
+        <w:gridCol w:w="7442"/>
       </w:tblGrid>
       <w:tr>
         <w:trPr/>
         <w:tc>
           <w:tcPr>
-            <w:tcW w:w="2203" w:type="dxa"/>
+            <w:tcW w:w="2202" w:type="dxa"/>
             <w:tcBorders/>
             <w:shd w:fill="auto" w:val="clear"/>
           </w:tcPr>
@@ -8899,7 +8899,7 @@
         </w:tc>
         <w:tc>
           <w:tcPr>
-            <w:tcW w:w="7441" w:type="dxa"/>
+            <w:tcW w:w="7442" w:type="dxa"/>
             <w:tcBorders/>
             <w:shd w:fill="auto" w:val="clear"/>
           </w:tcPr>
@@ -8923,7 +8923,7 @@
         <w:trPr/>
         <w:tc>
           <w:tcPr>
-            <w:tcW w:w="2203" w:type="dxa"/>
+            <w:tcW w:w="2202" w:type="dxa"/>
             <w:tcBorders/>
             <w:shd w:fill="auto" w:val="clear"/>
           </w:tcPr>
@@ -8942,7 +8942,7 @@
         </w:tc>
         <w:tc>
           <w:tcPr>
-            <w:tcW w:w="7441" w:type="dxa"/>
+            <w:tcW w:w="7442" w:type="dxa"/>
             <w:tcBorders/>
             <w:shd w:fill="auto" w:val="clear"/>
           </w:tcPr>
@@ -8964,7 +8964,7 @@
         <w:trPr/>
         <w:tc>
           <w:tcPr>
-            <w:tcW w:w="2203" w:type="dxa"/>
+            <w:tcW w:w="2202" w:type="dxa"/>
             <w:tcBorders/>
             <w:shd w:fill="auto" w:val="clear"/>
           </w:tcPr>
@@ -8983,7 +8983,7 @@
         </w:tc>
         <w:tc>
           <w:tcPr>
-            <w:tcW w:w="7441" w:type="dxa"/>
+            <w:tcW w:w="7442" w:type="dxa"/>
             <w:tcBorders/>
             <w:shd w:fill="auto" w:val="clear"/>
           </w:tcPr>
@@ -9005,7 +9005,7 @@
         <w:trPr/>
         <w:tc>
           <w:tcPr>
-            <w:tcW w:w="2203" w:type="dxa"/>
+            <w:tcW w:w="2202" w:type="dxa"/>
             <w:tcBorders/>
             <w:shd w:fill="auto" w:val="clear"/>
           </w:tcPr>
@@ -9024,7 +9024,7 @@
         </w:tc>
         <w:tc>
           <w:tcPr>
-            <w:tcW w:w="7441" w:type="dxa"/>
+            <w:tcW w:w="7442" w:type="dxa"/>
             <w:tcBorders/>
             <w:shd w:fill="auto" w:val="clear"/>
           </w:tcPr>
@@ -10231,70 +10231,32 @@
           <w:rFonts w:ascii="Verdana" w:hAnsi="Verdana"/>
           <w:lang w:val="da-DK"/>
         </w:rPr>
-        <w:t xml:space="preserve">CONTROL + </w:t>
-      </w:r>
+        <w:t>CONTROL + ARROW</w:t>
+      </w:r>
+      <w:r>
+        <w:rPr>
+          <w:rFonts w:ascii="Verdana" w:hAnsi="Verdana"/>
+        </w:rPr>
+        <w:t>-DOWN splits the line i the note list i single parts, starting by the first part..</w:t>
+      </w:r>
+    </w:p>
+    <w:p>
+      <w:pPr>
+        <w:pStyle w:val="Brdtekst"/>
+        <w:rPr/>
+      </w:pPr>
       <w:r>
         <w:rPr>
           <w:rFonts w:ascii="Verdana" w:hAnsi="Verdana"/>
           <w:lang w:val="da-DK"/>
         </w:rPr>
-        <w:t>ARROW</w:t>
+        <w:t>CONTROL + ARROW</w:t>
       </w:r>
       <w:r>
         <w:rPr>
           <w:rFonts w:ascii="Verdana" w:hAnsi="Verdana"/>
         </w:rPr>
-        <w:t>-</w:t>
-      </w:r>
-      <w:r>
-        <w:rPr>
-          <w:rFonts w:ascii="Verdana" w:hAnsi="Verdana"/>
-        </w:rPr>
-        <w:t>DOWN</w:t>
-      </w:r>
-      <w:r>
-        <w:rPr>
-          <w:rFonts w:ascii="Verdana" w:hAnsi="Verdana"/>
-        </w:rPr>
-        <w:t xml:space="preserve"> splits the line i the note list i single parts, starting by the first part..</w:t>
-      </w:r>
-    </w:p>
-    <w:p>
-      <w:pPr>
-        <w:pStyle w:val="Brdtekst"/>
-        <w:rPr/>
-      </w:pPr>
-      <w:r>
-        <w:rPr>
-          <w:rFonts w:ascii="Verdana" w:hAnsi="Verdana"/>
-          <w:lang w:val="da-DK"/>
-        </w:rPr>
-        <w:t xml:space="preserve">CONTROL + </w:t>
-      </w:r>
-      <w:r>
-        <w:rPr>
-          <w:rFonts w:ascii="Verdana" w:hAnsi="Verdana"/>
-          <w:lang w:val="da-DK"/>
-        </w:rPr>
-        <w:t>ARROW</w:t>
-      </w:r>
-      <w:r>
-        <w:rPr>
-          <w:rFonts w:ascii="Verdana" w:hAnsi="Verdana"/>
-        </w:rPr>
-        <w:t>-</w:t>
-      </w:r>
-      <w:r>
-        <w:rPr>
-          <w:rFonts w:ascii="Verdana" w:hAnsi="Verdana"/>
-        </w:rPr>
-        <w:t>UP</w:t>
-      </w:r>
-      <w:r>
-        <w:rPr>
-          <w:rFonts w:ascii="Verdana" w:hAnsi="Verdana"/>
-        </w:rPr>
-        <w:t xml:space="preserve"> stlits the line in the note list in single parts, starting by the last part.</w:t>
+        <w:t>-UP stlits the line in the note list in single parts, starting by the last part.</w:t>
       </w:r>
     </w:p>
     <w:p>
@@ -10811,15 +10773,25 @@
     <w:p>
       <w:pPr>
         <w:pStyle w:val="Normal"/>
-        <w:rPr>
-          <w:rFonts w:ascii="Verdana" w:hAnsi="Verdana" w:cs="Verdana"/>
-        </w:rPr>
-      </w:pPr>
-      <w:r>
-        <w:rPr>
-          <w:rFonts w:cs="Verdana" w:ascii="Verdana" w:hAnsi="Verdana"/>
-        </w:rPr>
-        <w:t>Note that there is an option for "Import Today's Transfers", namely "Import Transfers", which allows for details in detail to choose which files to import.</w:t>
+        <w:rPr/>
+      </w:pPr>
+      <w:r>
+        <w:rPr>
+          <w:rFonts w:cs="Verdana" w:ascii="Verdana" w:hAnsi="Verdana"/>
+        </w:rPr>
+        <w:t>Note that there is an option for "Import Today's Transfers", namely "Import Transfers", which allows choos</w:t>
+      </w:r>
+      <w:r>
+        <w:rPr>
+          <w:rFonts w:cs="Verdana" w:ascii="Verdana" w:hAnsi="Verdana"/>
+        </w:rPr>
+        <w:t xml:space="preserve">ing in detail </w:t>
+      </w:r>
+      <w:r>
+        <w:rPr>
+          <w:rFonts w:cs="Verdana" w:ascii="Verdana" w:hAnsi="Verdana"/>
+        </w:rPr>
+        <w:t>which files to import.</w:t>
       </w:r>
       <w:r>
         <w:br w:type="page"/>
@@ -11594,14 +11566,14 @@
         </w:tblCellMar>
       </w:tblPr>
       <w:tblGrid>
-        <w:gridCol w:w="2605"/>
-        <w:gridCol w:w="6420"/>
+        <w:gridCol w:w="2604"/>
+        <w:gridCol w:w="6421"/>
       </w:tblGrid>
       <w:tr>
         <w:trPr/>
         <w:tc>
           <w:tcPr>
-            <w:tcW w:w="2605" w:type="dxa"/>
+            <w:tcW w:w="2604" w:type="dxa"/>
             <w:tcBorders>
               <w:top w:val="single" w:sz="4" w:space="0" w:color="000000"/>
               <w:left w:val="single" w:sz="4" w:space="0" w:color="000000"/>
@@ -11653,7 +11625,7 @@
         </w:tc>
         <w:tc>
           <w:tcPr>
-            <w:tcW w:w="6420" w:type="dxa"/>
+            <w:tcW w:w="6421" w:type="dxa"/>
             <w:tcBorders>
               <w:top w:val="single" w:sz="4" w:space="0" w:color="000000"/>
               <w:left w:val="single" w:sz="4" w:space="0" w:color="000000"/>
@@ -11709,7 +11681,7 @@
         <w:trPr/>
         <w:tc>
           <w:tcPr>
-            <w:tcW w:w="2605" w:type="dxa"/>
+            <w:tcW w:w="2604" w:type="dxa"/>
             <w:tcBorders>
               <w:left w:val="single" w:sz="4" w:space="0" w:color="000000"/>
               <w:bottom w:val="single" w:sz="4" w:space="0" w:color="000000"/>
@@ -11760,7 +11732,7 @@
         </w:tc>
         <w:tc>
           <w:tcPr>
-            <w:tcW w:w="6420" w:type="dxa"/>
+            <w:tcW w:w="6421" w:type="dxa"/>
             <w:tcBorders>
               <w:left w:val="single" w:sz="4" w:space="0" w:color="000000"/>
               <w:bottom w:val="single" w:sz="4" w:space="0" w:color="000000"/>
@@ -11815,7 +11787,7 @@
         <w:trPr/>
         <w:tc>
           <w:tcPr>
-            <w:tcW w:w="2605" w:type="dxa"/>
+            <w:tcW w:w="2604" w:type="dxa"/>
             <w:tcBorders>
               <w:left w:val="single" w:sz="4" w:space="0" w:color="000000"/>
               <w:bottom w:val="single" w:sz="4" w:space="0" w:color="000000"/>
@@ -11866,7 +11838,7 @@
         </w:tc>
         <w:tc>
           <w:tcPr>
-            <w:tcW w:w="6420" w:type="dxa"/>
+            <w:tcW w:w="6421" w:type="dxa"/>
             <w:tcBorders>
               <w:left w:val="single" w:sz="4" w:space="0" w:color="000000"/>
               <w:bottom w:val="single" w:sz="4" w:space="0" w:color="000000"/>
@@ -15303,14 +15275,14 @@
         </w:tblCellMar>
       </w:tblPr>
       <w:tblGrid>
-        <w:gridCol w:w="2154"/>
-        <w:gridCol w:w="6800"/>
+        <w:gridCol w:w="2153"/>
+        <w:gridCol w:w="6801"/>
       </w:tblGrid>
       <w:tr>
         <w:trPr/>
         <w:tc>
           <w:tcPr>
-            <w:tcW w:w="2154" w:type="dxa"/>
+            <w:tcW w:w="2153" w:type="dxa"/>
             <w:tcBorders/>
             <w:shd w:fill="auto" w:val="clear"/>
           </w:tcPr>
@@ -15335,7 +15307,7 @@
         </w:tc>
         <w:tc>
           <w:tcPr>
-            <w:tcW w:w="6800" w:type="dxa"/>
+            <w:tcW w:w="6801" w:type="dxa"/>
             <w:tcBorders/>
             <w:shd w:fill="auto" w:val="clear"/>
           </w:tcPr>
@@ -15361,7 +15333,7 @@
         <w:trPr/>
         <w:tc>
           <w:tcPr>
-            <w:tcW w:w="2154" w:type="dxa"/>
+            <w:tcW w:w="2153" w:type="dxa"/>
             <w:tcBorders/>
             <w:shd w:fill="auto" w:val="clear"/>
           </w:tcPr>
@@ -15382,7 +15354,7 @@
         </w:tc>
         <w:tc>
           <w:tcPr>
-            <w:tcW w:w="6800" w:type="dxa"/>
+            <w:tcW w:w="6801" w:type="dxa"/>
             <w:tcBorders/>
             <w:shd w:fill="auto" w:val="clear"/>
           </w:tcPr>
@@ -15406,7 +15378,7 @@
         <w:trPr/>
         <w:tc>
           <w:tcPr>
-            <w:tcW w:w="2154" w:type="dxa"/>
+            <w:tcW w:w="2153" w:type="dxa"/>
             <w:tcBorders/>
             <w:shd w:fill="auto" w:val="clear"/>
           </w:tcPr>
@@ -15429,7 +15401,7 @@
         </w:tc>
         <w:tc>
           <w:tcPr>
-            <w:tcW w:w="6800" w:type="dxa"/>
+            <w:tcW w:w="6801" w:type="dxa"/>
             <w:tcBorders/>
             <w:shd w:fill="auto" w:val="clear"/>
           </w:tcPr>
@@ -15453,7 +15425,7 @@
         <w:trPr/>
         <w:tc>
           <w:tcPr>
-            <w:tcW w:w="2154" w:type="dxa"/>
+            <w:tcW w:w="2153" w:type="dxa"/>
             <w:tcBorders/>
             <w:shd w:fill="auto" w:val="clear"/>
           </w:tcPr>
@@ -15476,7 +15448,7 @@
         </w:tc>
         <w:tc>
           <w:tcPr>
-            <w:tcW w:w="6800" w:type="dxa"/>
+            <w:tcW w:w="6801" w:type="dxa"/>
             <w:tcBorders/>
             <w:shd w:fill="auto" w:val="clear"/>
           </w:tcPr>
@@ -15501,7 +15473,7 @@
         <w:trPr/>
         <w:tc>
           <w:tcPr>
-            <w:tcW w:w="2154" w:type="dxa"/>
+            <w:tcW w:w="2153" w:type="dxa"/>
             <w:tcBorders/>
             <w:shd w:fill="auto" w:val="clear"/>
           </w:tcPr>
@@ -15524,7 +15496,7 @@
         </w:tc>
         <w:tc>
           <w:tcPr>
-            <w:tcW w:w="6800" w:type="dxa"/>
+            <w:tcW w:w="6801" w:type="dxa"/>
             <w:tcBorders/>
             <w:shd w:fill="auto" w:val="clear"/>
           </w:tcPr>
@@ -15548,7 +15520,7 @@
         <w:trPr/>
         <w:tc>
           <w:tcPr>
-            <w:tcW w:w="2154" w:type="dxa"/>
+            <w:tcW w:w="2153" w:type="dxa"/>
             <w:tcBorders/>
             <w:shd w:fill="auto" w:val="clear"/>
           </w:tcPr>
@@ -15571,7 +15543,7 @@
         </w:tc>
         <w:tc>
           <w:tcPr>
-            <w:tcW w:w="6800" w:type="dxa"/>
+            <w:tcW w:w="6801" w:type="dxa"/>
             <w:tcBorders/>
             <w:shd w:fill="auto" w:val="clear"/>
           </w:tcPr>
@@ -15593,7 +15565,7 @@
         <w:trPr/>
         <w:tc>
           <w:tcPr>
-            <w:tcW w:w="2154" w:type="dxa"/>
+            <w:tcW w:w="2153" w:type="dxa"/>
             <w:tcBorders/>
             <w:shd w:fill="auto" w:val="clear"/>
           </w:tcPr>
@@ -15614,7 +15586,7 @@
         </w:tc>
         <w:tc>
           <w:tcPr>
-            <w:tcW w:w="6800" w:type="dxa"/>
+            <w:tcW w:w="6801" w:type="dxa"/>
             <w:tcBorders/>
             <w:shd w:fill="auto" w:val="clear"/>
           </w:tcPr>
@@ -15640,7 +15612,7 @@
         <w:trPr/>
         <w:tc>
           <w:tcPr>
-            <w:tcW w:w="2154" w:type="dxa"/>
+            <w:tcW w:w="2153" w:type="dxa"/>
             <w:tcBorders/>
             <w:shd w:fill="auto" w:val="clear"/>
           </w:tcPr>
@@ -15661,7 +15633,7 @@
         </w:tc>
         <w:tc>
           <w:tcPr>
-            <w:tcW w:w="6800" w:type="dxa"/>
+            <w:tcW w:w="6801" w:type="dxa"/>
             <w:tcBorders/>
             <w:shd w:fill="auto" w:val="clear"/>
           </w:tcPr>
@@ -15703,7 +15675,7 @@
         <w:trPr/>
         <w:tc>
           <w:tcPr>
-            <w:tcW w:w="2154" w:type="dxa"/>
+            <w:tcW w:w="2153" w:type="dxa"/>
             <w:tcBorders/>
             <w:shd w:fill="auto" w:val="clear"/>
           </w:tcPr>
@@ -15726,7 +15698,7 @@
         </w:tc>
         <w:tc>
           <w:tcPr>
-            <w:tcW w:w="6800" w:type="dxa"/>
+            <w:tcW w:w="6801" w:type="dxa"/>
             <w:tcBorders/>
             <w:shd w:fill="auto" w:val="clear"/>
           </w:tcPr>
@@ -15750,7 +15722,7 @@
         <w:trPr/>
         <w:tc>
           <w:tcPr>
-            <w:tcW w:w="2154" w:type="dxa"/>
+            <w:tcW w:w="2153" w:type="dxa"/>
             <w:tcBorders/>
             <w:shd w:fill="auto" w:val="clear"/>
           </w:tcPr>
@@ -15773,7 +15745,7 @@
         </w:tc>
         <w:tc>
           <w:tcPr>
-            <w:tcW w:w="6800" w:type="dxa"/>
+            <w:tcW w:w="6801" w:type="dxa"/>
             <w:tcBorders/>
             <w:shd w:fill="auto" w:val="clear"/>
           </w:tcPr>
@@ -15795,7 +15767,7 @@
         <w:trPr/>
         <w:tc>
           <w:tcPr>
-            <w:tcW w:w="2154" w:type="dxa"/>
+            <w:tcW w:w="2153" w:type="dxa"/>
             <w:tcBorders/>
             <w:shd w:fill="auto" w:val="clear"/>
           </w:tcPr>
@@ -15818,7 +15790,7 @@
         </w:tc>
         <w:tc>
           <w:tcPr>
-            <w:tcW w:w="6800" w:type="dxa"/>
+            <w:tcW w:w="6801" w:type="dxa"/>
             <w:tcBorders/>
             <w:shd w:fill="auto" w:val="clear"/>
           </w:tcPr>
@@ -16276,7 +16248,7 @@
       <w:rPr>
         <w:rStyle w:val="Sidetal"/>
       </w:rPr>
-      <w:t>17</w:t>
+      <w:t>2</w:t>
     </w:r>
     <w:r>
       <w:rPr>

</xml_diff>